<commit_message>
Se realizaron modificaciones en el frontend, especificamente en la forma de guiar al usuario
</commit_message>
<xml_diff>
--- a/backend/templates/SCPM-05 2025.docx
+++ b/backend/templates/SCPM-05 2025.docx
@@ -83,6 +83,7 @@
         <w:gridCol w:w="709"/>
       </w:tblGrid>
       <w:tr>
+        {% tr %}
         <w:trPr>
           <w:trHeight w:val="213"/>
           <w:tblCellSpacing w:w="20" w:type="dxa"/>
@@ -219,7 +220,6 @@
                 <w:sz w:val="20"/>
               </w:rPr>
             </w:pPr>
-            <w:proofErr w:type="gramStart"/>
             <w:r>
               <w:rPr>
                 <w:rFonts w:ascii="Arial" w:hAnsi="Arial"/>
@@ -234,23 +234,13 @@
               </w:rPr>
               <w:t xml:space="preserve"> </w:t>
             </w:r>
-            <w:proofErr w:type="spellStart"/>
-            <w:r>
-              <w:rPr>
-                <w:rFonts w:ascii="Arial" w:hAnsi="Arial"/>
-                <w:sz w:val="20"/>
-              </w:rPr>
-              <w:t>clave</w:t>
-            </w:r>
-            <w:proofErr w:type="gramEnd"/>
-            <w:r>
-              <w:rPr>
-                <w:rFonts w:ascii="Arial" w:hAnsi="Arial"/>
-                <w:sz w:val="20"/>
-              </w:rPr>
-              <w:t>_evento</w:t>
-            </w:r>
-            <w:proofErr w:type="spellEnd"/>
+            <w:r>
+              <w:rPr>
+                <w:rFonts w:ascii="Arial" w:hAnsi="Arial"/>
+                <w:sz w:val="20"/>
+              </w:rPr>
+              <w:t>clave_evento</w:t>
+            </w:r>
             <w:r>
               <w:rPr>
                 <w:rFonts w:ascii="Arial" w:hAnsi="Arial"/>
@@ -281,7 +271,6 @@
                 <w:sz w:val="20"/>
               </w:rPr>
             </w:pPr>
-            <w:proofErr w:type="gramStart"/>
             <w:r>
               <w:rPr>
                 <w:rFonts w:ascii="Arial" w:hAnsi="Arial"/>
@@ -296,23 +285,13 @@
               </w:rPr>
               <w:t xml:space="preserve"> </w:t>
             </w:r>
-            <w:proofErr w:type="spellStart"/>
-            <w:r>
-              <w:rPr>
-                <w:rFonts w:ascii="Arial" w:hAnsi="Arial"/>
-                <w:sz w:val="20"/>
-              </w:rPr>
-              <w:t>nombre</w:t>
-            </w:r>
-            <w:proofErr w:type="gramEnd"/>
-            <w:r>
-              <w:rPr>
-                <w:rFonts w:ascii="Arial" w:hAnsi="Arial"/>
-                <w:sz w:val="20"/>
-              </w:rPr>
-              <w:t>_evento</w:t>
-            </w:r>
-            <w:proofErr w:type="spellEnd"/>
+            <w:r>
+              <w:rPr>
+                <w:rFonts w:ascii="Arial" w:hAnsi="Arial"/>
+                <w:sz w:val="20"/>
+              </w:rPr>
+              <w:t>nombre_evento</w:t>
+            </w:r>
             <w:r>
               <w:rPr>
                 <w:rFonts w:ascii="Arial" w:hAnsi="Arial"/>
@@ -366,7 +345,6 @@
                 <w:sz w:val="20"/>
               </w:rPr>
             </w:pPr>
-            <w:proofErr w:type="gramStart"/>
             <w:r>
               <w:rPr>
                 <w:rFonts w:ascii="Arial" w:hAnsi="Arial"/>
@@ -388,7 +366,6 @@
               </w:rPr>
               <w:t>especialidad</w:t>
             </w:r>
-            <w:proofErr w:type="gramEnd"/>
             <w:r>
               <w:rPr>
                 <w:rFonts w:ascii="Arial" w:hAnsi="Arial"/>
@@ -627,7 +604,6 @@
                 <w:rFonts w:ascii="Arial" w:hAnsi="Arial"/>
               </w:rPr>
             </w:pPr>
-            <w:proofErr w:type="gramStart"/>
             <w:r>
               <w:rPr>
                 <w:rFonts w:ascii="Arial" w:hAnsi="Arial"/>
@@ -638,14 +614,7 @@
               <w:rPr>
                 <w:rFonts w:ascii="Arial" w:hAnsi="Arial"/>
               </w:rPr>
-              <w:t xml:space="preserve"> </w:t>
-            </w:r>
-            <w:proofErr w:type="spellStart"/>
-            <w:r>
-              <w:rPr>
-                <w:rFonts w:ascii="Arial" w:hAnsi="Arial"/>
-              </w:rPr>
-              <w:t>duraci</w:t>
+              <w:t xml:space="preserve"> duraci</w:t>
             </w:r>
             <w:r>
               <w:rPr>
@@ -657,15 +626,7 @@
               <w:rPr>
                 <w:rFonts w:ascii="Arial" w:hAnsi="Arial"/>
               </w:rPr>
-              <w:t>n</w:t>
-            </w:r>
-            <w:proofErr w:type="spellEnd"/>
-            <w:proofErr w:type="gramEnd"/>
-            <w:r>
-              <w:rPr>
-                <w:rFonts w:ascii="Arial" w:hAnsi="Arial"/>
-              </w:rPr>
-              <w:t xml:space="preserve"> </w:t>
+              <w:t xml:space="preserve">n </w:t>
             </w:r>
             <w:r>
               <w:rPr>
@@ -1183,14 +1144,7 @@
               <w:rPr>
                 <w:rFonts w:ascii="Arial" w:hAnsi="Arial"/>
               </w:rPr>
-              <w:t>{{</w:t>
-            </w:r>
-            <w:proofErr w:type="spellStart"/>
-            <w:r>
-              <w:rPr>
-                <w:rFonts w:ascii="Arial" w:hAnsi="Arial"/>
-              </w:rPr>
-              <w:t>d</w:t>
+              <w:t>{{d</w:t>
             </w:r>
             <w:r>
               <w:rPr>
@@ -1202,14 +1156,7 @@
               <w:rPr>
                 <w:rFonts w:ascii="Arial" w:hAnsi="Arial"/>
               </w:rPr>
-              <w:t>a_inicio</w:t>
-            </w:r>
-            <w:proofErr w:type="spellEnd"/>
-            <w:r>
-              <w:rPr>
-                <w:rFonts w:ascii="Arial" w:hAnsi="Arial"/>
-              </w:rPr>
-              <w:t>}}</w:t>
+              <w:t>a_inicio}}</w:t>
             </w:r>
           </w:p>
         </w:tc>
@@ -1230,21 +1177,7 @@
               <w:rPr>
                 <w:rFonts w:ascii="Arial" w:hAnsi="Arial"/>
               </w:rPr>
-              <w:t>{{</w:t>
-            </w:r>
-            <w:proofErr w:type="spellStart"/>
-            <w:r>
-              <w:rPr>
-                <w:rFonts w:ascii="Arial" w:hAnsi="Arial"/>
-              </w:rPr>
-              <w:t>mes_inicio</w:t>
-            </w:r>
-            <w:proofErr w:type="spellEnd"/>
-            <w:r>
-              <w:rPr>
-                <w:rFonts w:ascii="Arial" w:hAnsi="Arial"/>
-              </w:rPr>
-              <w:t>}}</w:t>
+              <w:t>{{mes_inicio}}</w:t>
             </w:r>
           </w:p>
         </w:tc>
@@ -1265,21 +1198,7 @@
               <w:rPr>
                 <w:rFonts w:ascii="Arial" w:hAnsi="Arial"/>
               </w:rPr>
-              <w:t>{{</w:t>
-            </w:r>
-            <w:proofErr w:type="spellStart"/>
-            <w:r>
-              <w:rPr>
-                <w:rFonts w:ascii="Arial" w:hAnsi="Arial"/>
-              </w:rPr>
-              <w:t>anio_inicio</w:t>
-            </w:r>
-            <w:proofErr w:type="spellEnd"/>
-            <w:r>
-              <w:rPr>
-                <w:rFonts w:ascii="Arial" w:hAnsi="Arial"/>
-              </w:rPr>
-              <w:t>}}</w:t>
+              <w:t>{{anio_inicio}}</w:t>
             </w:r>
           </w:p>
         </w:tc>
@@ -1314,14 +1233,7 @@
               <w:rPr>
                 <w:rFonts w:ascii="Arial" w:hAnsi="Arial"/>
               </w:rPr>
-              <w:t>{{</w:t>
-            </w:r>
-            <w:proofErr w:type="spellStart"/>
-            <w:r>
-              <w:rPr>
-                <w:rFonts w:ascii="Arial" w:hAnsi="Arial"/>
-              </w:rPr>
-              <w:t>d</w:t>
+              <w:t>{{d</w:t>
             </w:r>
             <w:r>
               <w:rPr>
@@ -1333,14 +1245,7 @@
               <w:rPr>
                 <w:rFonts w:ascii="Arial" w:hAnsi="Arial"/>
               </w:rPr>
-              <w:t>a_termino</w:t>
-            </w:r>
-            <w:proofErr w:type="spellEnd"/>
-            <w:r>
-              <w:rPr>
-                <w:rFonts w:ascii="Arial" w:hAnsi="Arial"/>
-              </w:rPr>
-              <w:t>}}</w:t>
+              <w:t>a_termino}}</w:t>
             </w:r>
           </w:p>
         </w:tc>
@@ -1361,21 +1266,7 @@
               <w:rPr>
                 <w:rFonts w:ascii="Arial" w:hAnsi="Arial"/>
               </w:rPr>
-              <w:t>{{</w:t>
-            </w:r>
-            <w:proofErr w:type="spellStart"/>
-            <w:r>
-              <w:rPr>
-                <w:rFonts w:ascii="Arial" w:hAnsi="Arial"/>
-              </w:rPr>
-              <w:t>mes_termino</w:t>
-            </w:r>
-            <w:proofErr w:type="spellEnd"/>
-            <w:r>
-              <w:rPr>
-                <w:rFonts w:ascii="Arial" w:hAnsi="Arial"/>
-              </w:rPr>
-              <w:t>}}</w:t>
+              <w:t>{{mes_termino}}</w:t>
             </w:r>
           </w:p>
         </w:tc>
@@ -1395,21 +1286,7 @@
               <w:rPr>
                 <w:rFonts w:ascii="Arial" w:hAnsi="Arial"/>
               </w:rPr>
-              <w:t>{{</w:t>
-            </w:r>
-            <w:proofErr w:type="spellStart"/>
-            <w:r>
-              <w:rPr>
-                <w:rFonts w:ascii="Arial" w:hAnsi="Arial"/>
-              </w:rPr>
-              <w:t>anio_termino</w:t>
-            </w:r>
-            <w:proofErr w:type="spellEnd"/>
-            <w:r>
-              <w:rPr>
-                <w:rFonts w:ascii="Arial" w:hAnsi="Arial"/>
-              </w:rPr>
-              <w:t>}}</w:t>
+              <w:t>{{anio_termino}}</w:t>
             </w:r>
           </w:p>
         </w:tc>
@@ -2048,82 +1925,8 @@
             <w:vAlign w:val="bottom"/>
           </w:tcPr>
           <w:p>
-            <w:pPr>
-              <w:rPr>
-                <w:rFonts w:ascii="Arial" w:hAnsi="Arial" w:cs="Arial"/>
-                <w:sz w:val="20"/>
-              </w:rPr>
-            </w:pPr>
-            <w:r>
-              <w:rPr>
-                <w:rFonts w:ascii="Arial" w:hAnsi="Arial" w:cs="Arial"/>
-                <w:sz w:val="20"/>
-              </w:rPr>
-              <w:t xml:space="preserve">{% </w:t>
-            </w:r>
-            <w:proofErr w:type="spellStart"/>
-            <w:r>
-              <w:rPr>
-                <w:rFonts w:ascii="Arial" w:hAnsi="Arial" w:cs="Arial"/>
-                <w:sz w:val="20"/>
-              </w:rPr>
-              <w:t>tr</w:t>
-            </w:r>
-            <w:proofErr w:type="spellEnd"/>
-            <w:r>
-              <w:rPr>
-                <w:rFonts w:ascii="Arial" w:hAnsi="Arial" w:cs="Arial"/>
-                <w:sz w:val="20"/>
-              </w:rPr>
-              <w:t xml:space="preserve"> for participante in </w:t>
-            </w:r>
-            <w:proofErr w:type="spellStart"/>
-            <w:r>
-              <w:rPr>
-                <w:rFonts w:ascii="Arial" w:hAnsi="Arial" w:cs="Arial"/>
-                <w:sz w:val="20"/>
-              </w:rPr>
-              <w:t>lista_participantes</w:t>
-            </w:r>
-            <w:proofErr w:type="spellEnd"/>
-            <w:r>
-              <w:rPr>
-                <w:rFonts w:ascii="Arial" w:hAnsi="Arial" w:cs="Arial"/>
-                <w:sz w:val="20"/>
-              </w:rPr>
-              <w:t xml:space="preserve"> </w:t>
-            </w:r>
-            <w:proofErr w:type="gramStart"/>
-            <w:r>
-              <w:rPr>
-                <w:rFonts w:ascii="Arial" w:hAnsi="Arial" w:cs="Arial"/>
-                <w:sz w:val="20"/>
-              </w:rPr>
-              <w:t xml:space="preserve">%}{{ </w:t>
-            </w:r>
-            <w:proofErr w:type="spellStart"/>
-            <w:r>
-              <w:rPr>
-                <w:rFonts w:ascii="Arial" w:hAnsi="Arial" w:cs="Arial"/>
-                <w:sz w:val="20"/>
-              </w:rPr>
-              <w:t>participante</w:t>
-            </w:r>
-            <w:proofErr w:type="gramEnd"/>
-            <w:r>
-              <w:rPr>
-                <w:rFonts w:ascii="Arial" w:hAnsi="Arial" w:cs="Arial"/>
-                <w:sz w:val="20"/>
-              </w:rPr>
-              <w:t>.ficha</w:t>
-            </w:r>
-            <w:proofErr w:type="spellEnd"/>
-            <w:r>
-              <w:rPr>
-                <w:rFonts w:ascii="Arial" w:hAnsi="Arial" w:cs="Arial"/>
-                <w:sz w:val="20"/>
-              </w:rPr>
-              <w:t xml:space="preserve"> }}</w:t>
+            <w:r>
+              <w:t>{% tr %}{% for participante in lista_participantes %}{{ participante.ficha }}</w:t>
             </w:r>
           </w:p>
         </w:tc>
@@ -2134,43 +1937,8 @@
             <w:vAlign w:val="bottom"/>
           </w:tcPr>
           <w:p>
-            <w:pPr>
-              <w:rPr>
-                <w:rFonts w:ascii="Arial" w:hAnsi="Arial" w:cs="Arial"/>
-                <w:sz w:val="20"/>
-              </w:rPr>
-            </w:pPr>
-            <w:proofErr w:type="gramStart"/>
-            <w:r>
-              <w:rPr>
-                <w:rFonts w:ascii="Arial" w:hAnsi="Arial" w:cs="Arial"/>
-                <w:sz w:val="20"/>
-              </w:rPr>
-              <w:t xml:space="preserve">{{ </w:t>
-            </w:r>
-            <w:proofErr w:type="spellStart"/>
-            <w:r>
-              <w:rPr>
-                <w:rFonts w:ascii="Arial" w:hAnsi="Arial" w:cs="Arial"/>
-                <w:sz w:val="20"/>
-              </w:rPr>
-              <w:t>participante</w:t>
-            </w:r>
-            <w:proofErr w:type="gramEnd"/>
-            <w:r>
-              <w:rPr>
-                <w:rFonts w:ascii="Arial" w:hAnsi="Arial" w:cs="Arial"/>
-                <w:sz w:val="20"/>
-              </w:rPr>
-              <w:t>.nombre_completo</w:t>
-            </w:r>
-            <w:proofErr w:type="spellEnd"/>
-            <w:r>
-              <w:rPr>
-                <w:rFonts w:ascii="Arial" w:hAnsi="Arial" w:cs="Arial"/>
-                <w:sz w:val="20"/>
-              </w:rPr>
-              <w:t xml:space="preserve"> }}</w:t>
+            <w:r>
+              <w:t>{{ participante.nombre_completo }}</w:t>
             </w:r>
           </w:p>
         </w:tc>
@@ -2181,12 +1949,7 @@
             <w:vAlign w:val="center"/>
           </w:tcPr>
           <w:p>
-            <w:pPr>
-              <w:rPr>
-                <w:rFonts w:ascii="Arial" w:hAnsi="Arial" w:cs="Arial"/>
-                <w:sz w:val="20"/>
-              </w:rPr>
-            </w:pPr>
+            <w:r/>
           </w:p>
         </w:tc>
         <w:tc>
@@ -2196,13 +1959,7 @@
             <w:vAlign w:val="bottom"/>
           </w:tcPr>
           <w:p>
-            <w:pPr>
-              <w:rPr>
-                <w:rFonts w:ascii="Arial" w:hAnsi="Arial" w:cs="Arial"/>
-                <w:sz w:val="16"/>
-                <w:szCs w:val="16"/>
-              </w:rPr>
-            </w:pPr>
+            <w:r/>
           </w:p>
         </w:tc>
         <w:tc>
@@ -2212,13 +1969,7 @@
             <w:vAlign w:val="bottom"/>
           </w:tcPr>
           <w:p>
-            <w:pPr>
-              <w:jc w:val="center"/>
-              <w:rPr>
-                <w:rFonts w:ascii="Arial" w:hAnsi="Arial" w:cs="Arial"/>
-                <w:sz w:val="20"/>
-              </w:rPr>
-            </w:pPr>
+            <w:r/>
           </w:p>
         </w:tc>
         <w:tc>
@@ -2228,13 +1979,7 @@
             <w:vAlign w:val="center"/>
           </w:tcPr>
           <w:p>
-            <w:pPr>
-              <w:jc w:val="center"/>
-              <w:rPr>
-                <w:rFonts w:ascii="Arial" w:hAnsi="Arial" w:cs="Arial"/>
-                <w:sz w:val="20"/>
-              </w:rPr>
-            </w:pPr>
+            <w:r/>
           </w:p>
         </w:tc>
         <w:tc>
@@ -2244,12 +1989,7 @@
             <w:vAlign w:val="center"/>
           </w:tcPr>
           <w:p>
-            <w:pPr>
-              <w:rPr>
-                <w:rFonts w:ascii="Arial" w:hAnsi="Arial" w:cs="Arial"/>
-                <w:sz w:val="20"/>
-              </w:rPr>
-            </w:pPr>
+            <w:r/>
           </w:p>
         </w:tc>
         <w:tc>
@@ -2259,12 +1999,7 @@
             <w:vAlign w:val="center"/>
           </w:tcPr>
           <w:p>
-            <w:pPr>
-              <w:rPr>
-                <w:rFonts w:ascii="Arial" w:hAnsi="Arial" w:cs="Arial"/>
-                <w:sz w:val="20"/>
-              </w:rPr>
-            </w:pPr>
+            <w:r/>
           </w:p>
         </w:tc>
         <w:tc>
@@ -2274,12 +2009,7 @@
             <w:vAlign w:val="center"/>
           </w:tcPr>
           <w:p>
-            <w:pPr>
-              <w:rPr>
-                <w:rFonts w:ascii="Arial" w:hAnsi="Arial" w:cs="Arial"/>
-                <w:sz w:val="20"/>
-              </w:rPr>
-            </w:pPr>
+            <w:r/>
           </w:p>
         </w:tc>
         <w:tc>
@@ -2289,12 +2019,7 @@
             <w:vAlign w:val="center"/>
           </w:tcPr>
           <w:p>
-            <w:pPr>
-              <w:rPr>
-                <w:rFonts w:ascii="Arial" w:hAnsi="Arial" w:cs="Arial"/>
-                <w:sz w:val="20"/>
-              </w:rPr>
-            </w:pPr>
+            <w:r/>
           </w:p>
         </w:tc>
         <w:tc>
@@ -2304,12 +2029,7 @@
             <w:vAlign w:val="center"/>
           </w:tcPr>
           <w:p>
-            <w:pPr>
-              <w:rPr>
-                <w:rFonts w:ascii="Arial" w:hAnsi="Arial" w:cs="Arial"/>
-                <w:sz w:val="20"/>
-              </w:rPr>
-            </w:pPr>
+            <w:r/>
           </w:p>
         </w:tc>
         <w:tc>
@@ -2319,18 +2039,8 @@
             <w:vAlign w:val="center"/>
           </w:tcPr>
           <w:p>
-            <w:pPr>
-              <w:rPr>
-                <w:rFonts w:ascii="Arial" w:hAnsi="Arial" w:cs="Arial"/>
-                <w:sz w:val="20"/>
-              </w:rPr>
-            </w:pPr>
-            <w:r>
-              <w:rPr>
-                <w:rFonts w:ascii="Arial" w:hAnsi="Arial" w:cs="Arial"/>
-                <w:sz w:val="20"/>
-              </w:rPr>
-              <w:t>{% tr endfor %}</w:t>
+            <w:r>
+              <w:t>{% endfor %}</w:t>
             </w:r>
           </w:p>
         </w:tc>
@@ -3435,103 +3145,31 @@
                 <w:sz w:val="22"/>
                 <w:szCs w:val="22"/>
               </w:rPr>
-              <w:t>{{</w:t>
-            </w:r>
-            <w:proofErr w:type="spellStart"/>
+              <w:t>{{nombre_instructor }}</w:t>
+            </w:r>
             <w:r>
               <w:rPr>
                 <w:rFonts w:ascii="Arial" w:hAnsi="Arial" w:cs="Arial"/>
                 <w:sz w:val="22"/>
                 <w:szCs w:val="22"/>
               </w:rPr>
-              <w:t>nombre_</w:t>
-            </w:r>
-            <w:proofErr w:type="gramStart"/>
+              <w:t xml:space="preserve"> </w:t>
+            </w:r>
             <w:r>
               <w:rPr>
                 <w:rFonts w:ascii="Arial" w:hAnsi="Arial" w:cs="Arial"/>
                 <w:sz w:val="22"/>
                 <w:szCs w:val="22"/>
               </w:rPr>
-              <w:t>instructor</w:t>
-            </w:r>
-            <w:proofErr w:type="spellEnd"/>
+              <w:t>F-</w:t>
+            </w:r>
             <w:r>
               <w:rPr>
                 <w:rFonts w:ascii="Arial" w:hAnsi="Arial" w:cs="Arial"/>
                 <w:sz w:val="22"/>
                 <w:szCs w:val="22"/>
               </w:rPr>
-              <w:t xml:space="preserve"> }</w:t>
-            </w:r>
-            <w:proofErr w:type="gramEnd"/>
-            <w:r>
-              <w:rPr>
-                <w:rFonts w:ascii="Arial" w:hAnsi="Arial" w:cs="Arial"/>
-                <w:sz w:val="22"/>
-                <w:szCs w:val="22"/>
-              </w:rPr>
-              <w:t>}</w:t>
-            </w:r>
-            <w:r>
-              <w:rPr>
-                <w:rFonts w:ascii="Arial" w:hAnsi="Arial" w:cs="Arial"/>
-                <w:sz w:val="22"/>
-                <w:szCs w:val="22"/>
-              </w:rPr>
-              <w:t xml:space="preserve"> </w:t>
-            </w:r>
-            <w:r>
-              <w:rPr>
-                <w:rFonts w:ascii="Arial" w:hAnsi="Arial" w:cs="Arial"/>
-                <w:sz w:val="22"/>
-                <w:szCs w:val="22"/>
-              </w:rPr>
-              <w:t>F-</w:t>
-            </w:r>
-            <w:r>
-              <w:rPr>
-                <w:rFonts w:ascii="Arial" w:hAnsi="Arial" w:cs="Arial"/>
-                <w:sz w:val="22"/>
-                <w:szCs w:val="22"/>
-              </w:rPr>
-              <w:t xml:space="preserve"> </w:t>
-            </w:r>
-            <w:proofErr w:type="gramStart"/>
-            <w:r>
-              <w:rPr>
-                <w:rFonts w:ascii="Arial" w:hAnsi="Arial" w:cs="Arial"/>
-                <w:sz w:val="22"/>
-                <w:szCs w:val="22"/>
-              </w:rPr>
-              <w:t xml:space="preserve">{{ </w:t>
-            </w:r>
-            <w:proofErr w:type="spellStart"/>
-            <w:r>
-              <w:rPr>
-                <w:rFonts w:ascii="Arial" w:hAnsi="Arial" w:cs="Arial"/>
-                <w:sz w:val="22"/>
-                <w:szCs w:val="22"/>
-              </w:rPr>
-              <w:t>ficha</w:t>
-            </w:r>
-            <w:proofErr w:type="gramEnd"/>
-            <w:r>
-              <w:rPr>
-                <w:rFonts w:ascii="Arial" w:hAnsi="Arial" w:cs="Arial"/>
-                <w:sz w:val="22"/>
-                <w:szCs w:val="22"/>
-              </w:rPr>
-              <w:t>_instructor</w:t>
-            </w:r>
-            <w:proofErr w:type="spellEnd"/>
-            <w:r>
-              <w:rPr>
-                <w:rFonts w:ascii="Arial" w:hAnsi="Arial" w:cs="Arial"/>
-                <w:sz w:val="22"/>
-                <w:szCs w:val="22"/>
-              </w:rPr>
-              <w:t xml:space="preserve"> }}</w:t>
+              <w:t xml:space="preserve"> {{ ficha_instructor }}</w:t>
             </w:r>
           </w:p>
         </w:tc>
@@ -4118,7 +3756,7 @@
               <v:shape id="_x0000_i1025" type="#_x0000_t75" alt="" style="width:129.6pt;height:45.1pt;mso-width-percent:0;mso-height-percent:0;mso-width-percent:0;mso-height-percent:0">
                 <v:imagedata r:id="rId1" o:title=""/>
               </v:shape>
-              <o:OLEObject Type="Embed" ProgID="PBrush" ShapeID="_x0000_i1025" DrawAspect="Content" ObjectID="_1850287790" r:id="rId2"/>
+              <o:OLEObject Type="Embed" ProgID="PBrush" ShapeID="_x0000_i1025" DrawAspect="Content" ObjectID="_1850309631" r:id="rId2"/>
             </w:object>
           </w:r>
         </w:p>
@@ -4630,6 +4268,7 @@
   <w:style w:type="character" w:default="1" w:styleId="Fuentedeprrafopredeter">
     <w:name w:val="Default Paragraph Font"/>
     <w:uiPriority w:val="1"/>
+    <w:semiHidden/>
     <w:unhideWhenUsed/>
   </w:style>
   <w:style w:type="table" w:default="1" w:styleId="Tablanormal">
@@ -5032,6 +4671,28 @@
 </file>
 
 <file path=customXml/item1.xml><?xml version="1.0" encoding="utf-8"?>
+<?mso-contentType ?>
+<FormTemplates xmlns="http://schemas.microsoft.com/sharepoint/v3/contenttype/forms">
+  <Display>DocumentLibraryForm</Display>
+  <Edit>DocumentLibraryForm</Edit>
+  <New>DocumentLibraryForm</New>
+</FormTemplates>
+</file>
+
+<file path=customXml/item2.xml><?xml version="1.0" encoding="utf-8"?>
+<p:properties xmlns:p="http://schemas.microsoft.com/office/2006/metadata/properties" xmlns:xsi="http://www.w3.org/2001/XMLSchema-instance" xmlns:pc="http://schemas.microsoft.com/office/infopath/2007/PartnerControls">
+  <documentManagement>
+    <lcf76f155ced4ddcb4097134ff3c332f xmlns="aa5afa56-7e35-446d-92fd-ff9896fa623a">
+      <Terms xmlns="http://schemas.microsoft.com/office/infopath/2007/PartnerControls"/>
+    </lcf76f155ced4ddcb4097134ff3c332f>
+    <TaxCatchAll xmlns="6fd75834-9ba6-41f9-b1c8-ae1f15b4a690" xsi:nil="true"/>
+    <_ip_UnifiedCompliancePolicyUIAction xmlns="http://schemas.microsoft.com/sharepoint/v3" xsi:nil="true"/>
+    <_ip_UnifiedCompliancePolicyProperties xmlns="http://schemas.microsoft.com/sharepoint/v3" xsi:nil="true"/>
+  </documentManagement>
+</p:properties>
+</file>
+
+<file path=customXml/item3.xml><?xml version="1.0" encoding="utf-8"?>
 <ct:contentTypeSchema xmlns:ct="http://schemas.microsoft.com/office/2006/metadata/contentType" xmlns:ma="http://schemas.microsoft.com/office/2006/metadata/properties/metaAttributes" ct:_="" ma:_="" ma:contentTypeName="Documento" ma:contentTypeID="0x010100A87C2EA155D72146AF5E83CE3CFFEB38" ma:contentTypeVersion="15" ma:contentTypeDescription="Crear nuevo documento." ma:contentTypeScope="" ma:versionID="18a8814fc859c49a9914bd993aa96308">
   <xsd:schema xmlns:xsd="http://www.w3.org/2001/XMLSchema" xmlns:xs="http://www.w3.org/2001/XMLSchema" xmlns:p="http://schemas.microsoft.com/office/2006/metadata/properties" xmlns:ns1="http://schemas.microsoft.com/sharepoint/v3" xmlns:ns2="aa5afa56-7e35-446d-92fd-ff9896fa623a" xmlns:ns3="6fd75834-9ba6-41f9-b1c8-ae1f15b4a690" targetNamespace="http://schemas.microsoft.com/office/2006/metadata/properties" ma:root="true" ma:fieldsID="b5ab34ea1fc8b639d8e6f399185c44ce" ns1:_="" ns2:_="" ns3:_="">
     <xsd:import namespace="http://schemas.microsoft.com/sharepoint/v3"/>
@@ -5255,33 +4916,31 @@
 </ct:contentTypeSchema>
 </file>
 
-<file path=customXml/item2.xml><?xml version="1.0" encoding="utf-8"?>
-<p:properties xmlns:p="http://schemas.microsoft.com/office/2006/metadata/properties" xmlns:xsi="http://www.w3.org/2001/XMLSchema-instance" xmlns:pc="http://schemas.microsoft.com/office/infopath/2007/PartnerControls">
-  <documentManagement>
-    <lcf76f155ced4ddcb4097134ff3c332f xmlns="aa5afa56-7e35-446d-92fd-ff9896fa623a">
-      <Terms xmlns="http://schemas.microsoft.com/office/infopath/2007/PartnerControls"/>
-    </lcf76f155ced4ddcb4097134ff3c332f>
-    <TaxCatchAll xmlns="6fd75834-9ba6-41f9-b1c8-ae1f15b4a690" xsi:nil="true"/>
-    <_ip_UnifiedCompliancePolicyUIAction xmlns="http://schemas.microsoft.com/sharepoint/v3" xsi:nil="true"/>
-    <_ip_UnifiedCompliancePolicyProperties xmlns="http://schemas.microsoft.com/sharepoint/v3" xsi:nil="true"/>
-  </documentManagement>
-</p:properties>
-</file>
-
-<file path=customXml/item3.xml><?xml version="1.0" encoding="utf-8"?>
-<?mso-contentType ?>
-<FormTemplates xmlns="http://schemas.microsoft.com/sharepoint/v3/contenttype/forms">
-  <Display>DocumentLibraryForm</Display>
-  <Edit>DocumentLibraryForm</Edit>
-  <New>DocumentLibraryForm</New>
-</FormTemplates>
-</file>
-
 <file path=customXml/item4.xml><?xml version="1.0" encoding="utf-8"?>
 <b:Sources xmlns:b="http://schemas.openxmlformats.org/officeDocument/2006/bibliography" xmlns="http://schemas.openxmlformats.org/officeDocument/2006/bibliography" SelectedStyle="\APASixthEditionOfficeOnline.xsl" StyleName="APA" Version="6"/>
 </file>
 
 <file path=customXml/itemProps1.xml><?xml version="1.0" encoding="utf-8"?>
+<ds:datastoreItem xmlns:ds="http://schemas.openxmlformats.org/officeDocument/2006/customXml" ds:itemID="{1A5A6B0B-D3EB-40CD-B919-06BA2CB67AEA}">
+  <ds:schemaRefs>
+    <ds:schemaRef ds:uri="http://schemas.microsoft.com/sharepoint/v3/contenttype/forms"/>
+  </ds:schemaRefs>
+</ds:datastoreItem>
+</file>
+
+<file path=customXml/itemProps2.xml><?xml version="1.0" encoding="utf-8"?>
+<ds:datastoreItem xmlns:ds="http://schemas.openxmlformats.org/officeDocument/2006/customXml" ds:itemID="{80A66124-CC99-4266-A874-6B19C62BC465}">
+  <ds:schemaRefs>
+    <ds:schemaRef ds:uri="http://schemas.microsoft.com/office/2006/metadata/properties"/>
+    <ds:schemaRef ds:uri="http://schemas.microsoft.com/office/infopath/2007/PartnerControls"/>
+    <ds:schemaRef ds:uri="aa5afa56-7e35-446d-92fd-ff9896fa623a"/>
+    <ds:schemaRef ds:uri="6fd75834-9ba6-41f9-b1c8-ae1f15b4a690"/>
+    <ds:schemaRef ds:uri="http://schemas.microsoft.com/sharepoint/v3"/>
+  </ds:schemaRefs>
+</ds:datastoreItem>
+</file>
+
+<file path=customXml/itemProps3.xml><?xml version="1.0" encoding="utf-8"?>
 <ds:datastoreItem xmlns:ds="http://schemas.openxmlformats.org/officeDocument/2006/customXml" ds:itemID="{C7A367BE-7B43-44E8-A6EE-18C956303CD0}">
   <ds:schemaRefs>
     <ds:schemaRef ds:uri="http://schemas.microsoft.com/office/2006/metadata/contentType"/>
@@ -5301,26 +4960,6 @@
 </ds:datastoreItem>
 </file>
 
-<file path=customXml/itemProps2.xml><?xml version="1.0" encoding="utf-8"?>
-<ds:datastoreItem xmlns:ds="http://schemas.openxmlformats.org/officeDocument/2006/customXml" ds:itemID="{80A66124-CC99-4266-A874-6B19C62BC465}">
-  <ds:schemaRefs>
-    <ds:schemaRef ds:uri="http://schemas.microsoft.com/office/2006/metadata/properties"/>
-    <ds:schemaRef ds:uri="http://schemas.microsoft.com/office/infopath/2007/PartnerControls"/>
-    <ds:schemaRef ds:uri="aa5afa56-7e35-446d-92fd-ff9896fa623a"/>
-    <ds:schemaRef ds:uri="6fd75834-9ba6-41f9-b1c8-ae1f15b4a690"/>
-    <ds:schemaRef ds:uri="http://schemas.microsoft.com/sharepoint/v3"/>
-  </ds:schemaRefs>
-</ds:datastoreItem>
-</file>
-
-<file path=customXml/itemProps3.xml><?xml version="1.0" encoding="utf-8"?>
-<ds:datastoreItem xmlns:ds="http://schemas.openxmlformats.org/officeDocument/2006/customXml" ds:itemID="{1A5A6B0B-D3EB-40CD-B919-06BA2CB67AEA}">
-  <ds:schemaRefs>
-    <ds:schemaRef ds:uri="http://schemas.microsoft.com/sharepoint/v3/contenttype/forms"/>
-  </ds:schemaRefs>
-</ds:datastoreItem>
-</file>
-
 <file path=customXml/itemProps4.xml><?xml version="1.0" encoding="utf-8"?>
 <ds:datastoreItem xmlns:ds="http://schemas.openxmlformats.org/officeDocument/2006/customXml" ds:itemID="{F11C60CF-23AA-469C-9C7A-597742E474D2}">
   <ds:schemaRefs>

</xml_diff>

<commit_message>
Se realizo la correccion de los archivos SCPM-05 y SCPM-07.
</commit_message>
<xml_diff>
--- a/backend/templates/SCPM-05 2025.docx
+++ b/backend/templates/SCPM-05 2025.docx
@@ -83,7 +83,6 @@
         <w:gridCol w:w="709"/>
       </w:tblGrid>
       <w:tr>
-        {% tr %}
         <w:trPr>
           <w:trHeight w:val="213"/>
           <w:tblCellSpacing w:w="20" w:type="dxa"/>
@@ -1926,7 +1925,7 @@
           </w:tcPr>
           <w:p>
             <w:r>
-              <w:t>{% tr %}{% for participante in lista_participantes %}{{ participante.ficha }}</w:t>
+              <w:t>{%tr for participante in lista_participantes %}</w:t>
             </w:r>
           </w:p>
         </w:tc>
@@ -1937,9 +1936,7 @@
             <w:vAlign w:val="bottom"/>
           </w:tcPr>
           <w:p>
-            <w:r>
-              <w:t>{{ participante.nombre_completo }}</w:t>
-            </w:r>
+            <w:r/>
           </w:p>
         </w:tc>
         <w:tc>
@@ -2039,9 +2036,263 @@
             <w:vAlign w:val="center"/>
           </w:tcPr>
           <w:p>
-            <w:r>
-              <w:t>{% endfor %}</w:t>
-            </w:r>
+            <w:r/>
+          </w:p>
+        </w:tc>
+      </w:tr>
+      <w:tr>
+        <w:trPr>
+          <w:trHeight w:val="260"/>
+          <w:tblCellSpacing w:w="20" w:type="dxa"/>
+        </w:trPr>
+        <w:tc>
+          <w:tcPr>
+            <w:tcW w:w="1066" w:type="dxa"/>
+            <w:vAlign w:val="bottom"/>
+          </w:tcPr>
+          <w:p>
+            <w:r>
+              <w:t>{{ participante.ficha }}</w:t>
+            </w:r>
+          </w:p>
+        </w:tc>
+        <w:tc>
+          <w:tcPr>
+            <w:tcW w:w="3461" w:type="dxa"/>
+            <w:gridSpan w:val="4"/>
+            <w:vAlign w:val="bottom"/>
+          </w:tcPr>
+          <w:p>
+            <w:r>
+              <w:t>{{ participante.nombre_completo }}</w:t>
+            </w:r>
+          </w:p>
+        </w:tc>
+        <w:tc>
+          <w:tcPr>
+            <w:tcW w:w="854" w:type="dxa"/>
+            <w:gridSpan w:val="2"/>
+            <w:vAlign w:val="center"/>
+          </w:tcPr>
+          <w:p>
+            <w:r/>
+          </w:p>
+        </w:tc>
+        <w:tc>
+          <w:tcPr>
+            <w:tcW w:w="2653" w:type="dxa"/>
+            <w:gridSpan w:val="3"/>
+            <w:vAlign w:val="bottom"/>
+          </w:tcPr>
+          <w:p>
+            <w:r/>
+          </w:p>
+        </w:tc>
+        <w:tc>
+          <w:tcPr>
+            <w:tcW w:w="683" w:type="dxa"/>
+            <w:gridSpan w:val="3"/>
+            <w:vAlign w:val="bottom"/>
+          </w:tcPr>
+          <w:p>
+            <w:r/>
+          </w:p>
+        </w:tc>
+        <w:tc>
+          <w:tcPr>
+            <w:tcW w:w="796" w:type="dxa"/>
+            <w:gridSpan w:val="2"/>
+            <w:vAlign w:val="center"/>
+          </w:tcPr>
+          <w:p>
+            <w:r/>
+          </w:p>
+        </w:tc>
+        <w:tc>
+          <w:tcPr>
+            <w:tcW w:w="1094" w:type="dxa"/>
+            <w:gridSpan w:val="2"/>
+            <w:vAlign w:val="center"/>
+          </w:tcPr>
+          <w:p>
+            <w:r/>
+          </w:p>
+        </w:tc>
+        <w:tc>
+          <w:tcPr>
+            <w:tcW w:w="811" w:type="dxa"/>
+            <w:gridSpan w:val="2"/>
+            <w:vAlign w:val="center"/>
+          </w:tcPr>
+          <w:p>
+            <w:r/>
+          </w:p>
+        </w:tc>
+        <w:tc>
+          <w:tcPr>
+            <w:tcW w:w="668" w:type="dxa"/>
+            <w:gridSpan w:val="3"/>
+            <w:vAlign w:val="center"/>
+          </w:tcPr>
+          <w:p>
+            <w:r/>
+          </w:p>
+        </w:tc>
+        <w:tc>
+          <w:tcPr>
+            <w:tcW w:w="669" w:type="dxa"/>
+            <w:gridSpan w:val="2"/>
+            <w:vAlign w:val="center"/>
+          </w:tcPr>
+          <w:p>
+            <w:r/>
+          </w:p>
+        </w:tc>
+        <w:tc>
+          <w:tcPr>
+            <w:tcW w:w="669" w:type="dxa"/>
+            <w:gridSpan w:val="2"/>
+            <w:vAlign w:val="center"/>
+          </w:tcPr>
+          <w:p>
+            <w:r/>
+          </w:p>
+        </w:tc>
+        <w:tc>
+          <w:tcPr>
+            <w:tcW w:w="1216" w:type="dxa"/>
+            <w:gridSpan w:val="2"/>
+            <w:vAlign w:val="center"/>
+          </w:tcPr>
+          <w:p>
+            <w:r/>
+          </w:p>
+        </w:tc>
+      </w:tr>
+      <w:tr>
+        <w:trPr>
+          <w:trHeight w:val="260"/>
+          <w:tblCellSpacing w:w="20" w:type="dxa"/>
+        </w:trPr>
+        <w:tc>
+          <w:tcPr>
+            <w:tcW w:w="1066" w:type="dxa"/>
+            <w:vAlign w:val="bottom"/>
+          </w:tcPr>
+          <w:p>
+            <w:r>
+              <w:t>{%tr endfor %}</w:t>
+            </w:r>
+          </w:p>
+        </w:tc>
+        <w:tc>
+          <w:tcPr>
+            <w:tcW w:w="3461" w:type="dxa"/>
+            <w:gridSpan w:val="4"/>
+            <w:vAlign w:val="bottom"/>
+          </w:tcPr>
+          <w:p>
+            <w:r/>
+          </w:p>
+        </w:tc>
+        <w:tc>
+          <w:tcPr>
+            <w:tcW w:w="854" w:type="dxa"/>
+            <w:gridSpan w:val="2"/>
+            <w:vAlign w:val="center"/>
+          </w:tcPr>
+          <w:p>
+            <w:r/>
+          </w:p>
+        </w:tc>
+        <w:tc>
+          <w:tcPr>
+            <w:tcW w:w="2653" w:type="dxa"/>
+            <w:gridSpan w:val="3"/>
+            <w:vAlign w:val="bottom"/>
+          </w:tcPr>
+          <w:p>
+            <w:r/>
+          </w:p>
+        </w:tc>
+        <w:tc>
+          <w:tcPr>
+            <w:tcW w:w="683" w:type="dxa"/>
+            <w:gridSpan w:val="3"/>
+            <w:vAlign w:val="bottom"/>
+          </w:tcPr>
+          <w:p>
+            <w:r/>
+          </w:p>
+        </w:tc>
+        <w:tc>
+          <w:tcPr>
+            <w:tcW w:w="796" w:type="dxa"/>
+            <w:gridSpan w:val="2"/>
+            <w:vAlign w:val="center"/>
+          </w:tcPr>
+          <w:p>
+            <w:r/>
+          </w:p>
+        </w:tc>
+        <w:tc>
+          <w:tcPr>
+            <w:tcW w:w="1094" w:type="dxa"/>
+            <w:gridSpan w:val="2"/>
+            <w:vAlign w:val="center"/>
+          </w:tcPr>
+          <w:p>
+            <w:r/>
+          </w:p>
+        </w:tc>
+        <w:tc>
+          <w:tcPr>
+            <w:tcW w:w="811" w:type="dxa"/>
+            <w:gridSpan w:val="2"/>
+            <w:vAlign w:val="center"/>
+          </w:tcPr>
+          <w:p>
+            <w:r/>
+          </w:p>
+        </w:tc>
+        <w:tc>
+          <w:tcPr>
+            <w:tcW w:w="668" w:type="dxa"/>
+            <w:gridSpan w:val="3"/>
+            <w:vAlign w:val="center"/>
+          </w:tcPr>
+          <w:p>
+            <w:r/>
+          </w:p>
+        </w:tc>
+        <w:tc>
+          <w:tcPr>
+            <w:tcW w:w="669" w:type="dxa"/>
+            <w:gridSpan w:val="2"/>
+            <w:vAlign w:val="center"/>
+          </w:tcPr>
+          <w:p>
+            <w:r/>
+          </w:p>
+        </w:tc>
+        <w:tc>
+          <w:tcPr>
+            <w:tcW w:w="669" w:type="dxa"/>
+            <w:gridSpan w:val="2"/>
+            <w:vAlign w:val="center"/>
+          </w:tcPr>
+          <w:p>
+            <w:r/>
+          </w:p>
+        </w:tc>
+        <w:tc>
+          <w:tcPr>
+            <w:tcW w:w="1216" w:type="dxa"/>
+            <w:gridSpan w:val="2"/>
+            <w:vAlign w:val="center"/>
+          </w:tcPr>
+          <w:p>
+            <w:r/>
           </w:p>
         </w:tc>
       </w:tr>

</xml_diff>

<commit_message>
Nuevas modificaciones requeridad por el cliente
</commit_message>
<xml_diff>
--- a/backend/templates/SCPM-05 2025.docx
+++ b/backend/templates/SCPM-05 2025.docx
@@ -219,6 +219,7 @@
                 <w:sz w:val="20"/>
               </w:rPr>
             </w:pPr>
+            <w:proofErr w:type="gramStart"/>
             <w:r>
               <w:rPr>
                 <w:rFonts w:ascii="Arial" w:hAnsi="Arial"/>
@@ -233,13 +234,23 @@
               </w:rPr>
               <w:t xml:space="preserve"> </w:t>
             </w:r>
+            <w:proofErr w:type="spellStart"/>
             <w:r>
               <w:rPr>
                 <w:rFonts w:ascii="Arial" w:hAnsi="Arial"/>
                 <w:sz w:val="20"/>
               </w:rPr>
-              <w:t>clave_evento</w:t>
-            </w:r>
+              <w:t>clave</w:t>
+            </w:r>
+            <w:proofErr w:type="gramEnd"/>
+            <w:r>
+              <w:rPr>
+                <w:rFonts w:ascii="Arial" w:hAnsi="Arial"/>
+                <w:sz w:val="20"/>
+              </w:rPr>
+              <w:t>_evento</w:t>
+            </w:r>
+            <w:proofErr w:type="spellEnd"/>
             <w:r>
               <w:rPr>
                 <w:rFonts w:ascii="Arial" w:hAnsi="Arial"/>
@@ -270,6 +281,7 @@
                 <w:sz w:val="20"/>
               </w:rPr>
             </w:pPr>
+            <w:proofErr w:type="gramStart"/>
             <w:r>
               <w:rPr>
                 <w:rFonts w:ascii="Arial" w:hAnsi="Arial"/>
@@ -284,13 +296,23 @@
               </w:rPr>
               <w:t xml:space="preserve"> </w:t>
             </w:r>
+            <w:proofErr w:type="spellStart"/>
             <w:r>
               <w:rPr>
                 <w:rFonts w:ascii="Arial" w:hAnsi="Arial"/>
                 <w:sz w:val="20"/>
               </w:rPr>
-              <w:t>nombre_evento</w:t>
-            </w:r>
+              <w:t>nombre</w:t>
+            </w:r>
+            <w:proofErr w:type="gramEnd"/>
+            <w:r>
+              <w:rPr>
+                <w:rFonts w:ascii="Arial" w:hAnsi="Arial"/>
+                <w:sz w:val="20"/>
+              </w:rPr>
+              <w:t>_evento</w:t>
+            </w:r>
+            <w:proofErr w:type="spellEnd"/>
             <w:r>
               <w:rPr>
                 <w:rFonts w:ascii="Arial" w:hAnsi="Arial"/>
@@ -344,6 +366,7 @@
                 <w:sz w:val="20"/>
               </w:rPr>
             </w:pPr>
+            <w:proofErr w:type="gramStart"/>
             <w:r>
               <w:rPr>
                 <w:rFonts w:ascii="Arial" w:hAnsi="Arial"/>
@@ -365,6 +388,7 @@
               </w:rPr>
               <w:t>especialidad</w:t>
             </w:r>
+            <w:proofErr w:type="gramEnd"/>
             <w:r>
               <w:rPr>
                 <w:rFonts w:ascii="Arial" w:hAnsi="Arial"/>
@@ -603,6 +627,7 @@
                 <w:rFonts w:ascii="Arial" w:hAnsi="Arial"/>
               </w:rPr>
             </w:pPr>
+            <w:proofErr w:type="gramStart"/>
             <w:r>
               <w:rPr>
                 <w:rFonts w:ascii="Arial" w:hAnsi="Arial"/>
@@ -613,7 +638,14 @@
               <w:rPr>
                 <w:rFonts w:ascii="Arial" w:hAnsi="Arial"/>
               </w:rPr>
-              <w:t xml:space="preserve"> duraci</w:t>
+              <w:t xml:space="preserve"> </w:t>
+            </w:r>
+            <w:proofErr w:type="spellStart"/>
+            <w:r>
+              <w:rPr>
+                <w:rFonts w:ascii="Arial" w:hAnsi="Arial"/>
+              </w:rPr>
+              <w:t>duraci</w:t>
             </w:r>
             <w:r>
               <w:rPr>
@@ -625,7 +657,15 @@
               <w:rPr>
                 <w:rFonts w:ascii="Arial" w:hAnsi="Arial"/>
               </w:rPr>
-              <w:t xml:space="preserve">n </w:t>
+              <w:t>n</w:t>
+            </w:r>
+            <w:proofErr w:type="spellEnd"/>
+            <w:proofErr w:type="gramEnd"/>
+            <w:r>
+              <w:rPr>
+                <w:rFonts w:ascii="Arial" w:hAnsi="Arial"/>
+              </w:rPr>
+              <w:t xml:space="preserve"> </w:t>
             </w:r>
             <w:r>
               <w:rPr>
@@ -1143,7 +1183,14 @@
               <w:rPr>
                 <w:rFonts w:ascii="Arial" w:hAnsi="Arial"/>
               </w:rPr>
-              <w:t>{{d</w:t>
+              <w:t>{{</w:t>
+            </w:r>
+            <w:proofErr w:type="spellStart"/>
+            <w:r>
+              <w:rPr>
+                <w:rFonts w:ascii="Arial" w:hAnsi="Arial"/>
+              </w:rPr>
+              <w:t>d</w:t>
             </w:r>
             <w:r>
               <w:rPr>
@@ -1155,7 +1202,14 @@
               <w:rPr>
                 <w:rFonts w:ascii="Arial" w:hAnsi="Arial"/>
               </w:rPr>
-              <w:t>a_inicio}}</w:t>
+              <w:t>a_inicio</w:t>
+            </w:r>
+            <w:proofErr w:type="spellEnd"/>
+            <w:r>
+              <w:rPr>
+                <w:rFonts w:ascii="Arial" w:hAnsi="Arial"/>
+              </w:rPr>
+              <w:t>}}</w:t>
             </w:r>
           </w:p>
         </w:tc>
@@ -1176,7 +1230,21 @@
               <w:rPr>
                 <w:rFonts w:ascii="Arial" w:hAnsi="Arial"/>
               </w:rPr>
-              <w:t>{{mes_inicio}}</w:t>
+              <w:t>{{</w:t>
+            </w:r>
+            <w:proofErr w:type="spellStart"/>
+            <w:r>
+              <w:rPr>
+                <w:rFonts w:ascii="Arial" w:hAnsi="Arial"/>
+              </w:rPr>
+              <w:t>mes_inicio</w:t>
+            </w:r>
+            <w:proofErr w:type="spellEnd"/>
+            <w:r>
+              <w:rPr>
+                <w:rFonts w:ascii="Arial" w:hAnsi="Arial"/>
+              </w:rPr>
+              <w:t>}}</w:t>
             </w:r>
           </w:p>
         </w:tc>
@@ -1197,7 +1265,21 @@
               <w:rPr>
                 <w:rFonts w:ascii="Arial" w:hAnsi="Arial"/>
               </w:rPr>
-              <w:t>{{anio_inicio}}</w:t>
+              <w:t>{{</w:t>
+            </w:r>
+            <w:proofErr w:type="spellStart"/>
+            <w:r>
+              <w:rPr>
+                <w:rFonts w:ascii="Arial" w:hAnsi="Arial"/>
+              </w:rPr>
+              <w:t>anio_inicio</w:t>
+            </w:r>
+            <w:proofErr w:type="spellEnd"/>
+            <w:r>
+              <w:rPr>
+                <w:rFonts w:ascii="Arial" w:hAnsi="Arial"/>
+              </w:rPr>
+              <w:t>}}</w:t>
             </w:r>
           </w:p>
         </w:tc>
@@ -1232,7 +1314,14 @@
               <w:rPr>
                 <w:rFonts w:ascii="Arial" w:hAnsi="Arial"/>
               </w:rPr>
-              <w:t>{{d</w:t>
+              <w:t>{{</w:t>
+            </w:r>
+            <w:proofErr w:type="spellStart"/>
+            <w:r>
+              <w:rPr>
+                <w:rFonts w:ascii="Arial" w:hAnsi="Arial"/>
+              </w:rPr>
+              <w:t>d</w:t>
             </w:r>
             <w:r>
               <w:rPr>
@@ -1244,7 +1333,14 @@
               <w:rPr>
                 <w:rFonts w:ascii="Arial" w:hAnsi="Arial"/>
               </w:rPr>
-              <w:t>a_termino}}</w:t>
+              <w:t>a_termino</w:t>
+            </w:r>
+            <w:proofErr w:type="spellEnd"/>
+            <w:r>
+              <w:rPr>
+                <w:rFonts w:ascii="Arial" w:hAnsi="Arial"/>
+              </w:rPr>
+              <w:t>}}</w:t>
             </w:r>
           </w:p>
         </w:tc>
@@ -1265,7 +1361,21 @@
               <w:rPr>
                 <w:rFonts w:ascii="Arial" w:hAnsi="Arial"/>
               </w:rPr>
-              <w:t>{{mes_termino}}</w:t>
+              <w:t>{{</w:t>
+            </w:r>
+            <w:proofErr w:type="spellStart"/>
+            <w:r>
+              <w:rPr>
+                <w:rFonts w:ascii="Arial" w:hAnsi="Arial"/>
+              </w:rPr>
+              <w:t>mes_termino</w:t>
+            </w:r>
+            <w:proofErr w:type="spellEnd"/>
+            <w:r>
+              <w:rPr>
+                <w:rFonts w:ascii="Arial" w:hAnsi="Arial"/>
+              </w:rPr>
+              <w:t>}}</w:t>
             </w:r>
           </w:p>
         </w:tc>
@@ -1285,7 +1395,21 @@
               <w:rPr>
                 <w:rFonts w:ascii="Arial" w:hAnsi="Arial"/>
               </w:rPr>
-              <w:t>{{anio_termino}}</w:t>
+              <w:t>{{</w:t>
+            </w:r>
+            <w:proofErr w:type="spellStart"/>
+            <w:r>
+              <w:rPr>
+                <w:rFonts w:ascii="Arial" w:hAnsi="Arial"/>
+              </w:rPr>
+              <w:t>anio_termino</w:t>
+            </w:r>
+            <w:proofErr w:type="spellEnd"/>
+            <w:r>
+              <w:rPr>
+                <w:rFonts w:ascii="Arial" w:hAnsi="Arial"/>
+              </w:rPr>
+              <w:t>}}</w:t>
             </w:r>
           </w:p>
         </w:tc>
@@ -1925,7 +2049,23 @@
           </w:tcPr>
           <w:p>
             <w:r>
-              <w:t>{%tr for participante in lista_participantes %}</w:t>
+              <w:t>{%</w:t>
+            </w:r>
+            <w:proofErr w:type="spellStart"/>
+            <w:r>
+              <w:t>tr</w:t>
+            </w:r>
+            <w:proofErr w:type="spellEnd"/>
+            <w:r>
+              <w:t xml:space="preserve"> for participante in </w:t>
+            </w:r>
+            <w:proofErr w:type="spellStart"/>
+            <w:r>
+              <w:t>lista_participantes</w:t>
+            </w:r>
+            <w:proofErr w:type="spellEnd"/>
+            <w:r>
+              <w:t xml:space="preserve"> %}</w:t>
             </w:r>
           </w:p>
         </w:tc>
@@ -1935,9 +2075,7 @@
             <w:gridSpan w:val="4"/>
             <w:vAlign w:val="bottom"/>
           </w:tcPr>
-          <w:p>
-            <w:r/>
-          </w:p>
+          <w:p/>
         </w:tc>
         <w:tc>
           <w:tcPr>
@@ -1945,9 +2083,7 @@
             <w:gridSpan w:val="2"/>
             <w:vAlign w:val="center"/>
           </w:tcPr>
-          <w:p>
-            <w:r/>
-          </w:p>
+          <w:p/>
         </w:tc>
         <w:tc>
           <w:tcPr>
@@ -1955,9 +2091,7 @@
             <w:gridSpan w:val="3"/>
             <w:vAlign w:val="bottom"/>
           </w:tcPr>
-          <w:p>
-            <w:r/>
-          </w:p>
+          <w:p/>
         </w:tc>
         <w:tc>
           <w:tcPr>
@@ -1965,9 +2099,7 @@
             <w:gridSpan w:val="3"/>
             <w:vAlign w:val="bottom"/>
           </w:tcPr>
-          <w:p>
-            <w:r/>
-          </w:p>
+          <w:p/>
         </w:tc>
         <w:tc>
           <w:tcPr>
@@ -1975,9 +2107,7 @@
             <w:gridSpan w:val="2"/>
             <w:vAlign w:val="center"/>
           </w:tcPr>
-          <w:p>
-            <w:r/>
-          </w:p>
+          <w:p/>
         </w:tc>
         <w:tc>
           <w:tcPr>
@@ -1985,9 +2115,7 @@
             <w:gridSpan w:val="2"/>
             <w:vAlign w:val="center"/>
           </w:tcPr>
-          <w:p>
-            <w:r/>
-          </w:p>
+          <w:p/>
         </w:tc>
         <w:tc>
           <w:tcPr>
@@ -1995,9 +2123,7 @@
             <w:gridSpan w:val="2"/>
             <w:vAlign w:val="center"/>
           </w:tcPr>
-          <w:p>
-            <w:r/>
-          </w:p>
+          <w:p/>
         </w:tc>
         <w:tc>
           <w:tcPr>
@@ -2005,9 +2131,7 @@
             <w:gridSpan w:val="3"/>
             <w:vAlign w:val="center"/>
           </w:tcPr>
-          <w:p>
-            <w:r/>
-          </w:p>
+          <w:p/>
         </w:tc>
         <w:tc>
           <w:tcPr>
@@ -2015,9 +2139,7 @@
             <w:gridSpan w:val="2"/>
             <w:vAlign w:val="center"/>
           </w:tcPr>
-          <w:p>
-            <w:r/>
-          </w:p>
+          <w:p/>
         </w:tc>
         <w:tc>
           <w:tcPr>
@@ -2025,9 +2147,7 @@
             <w:gridSpan w:val="2"/>
             <w:vAlign w:val="center"/>
           </w:tcPr>
-          <w:p>
-            <w:r/>
-          </w:p>
+          <w:p/>
         </w:tc>
         <w:tc>
           <w:tcPr>
@@ -2035,9 +2155,7 @@
             <w:gridSpan w:val="2"/>
             <w:vAlign w:val="center"/>
           </w:tcPr>
-          <w:p>
-            <w:r/>
-          </w:p>
+          <w:p/>
         </w:tc>
       </w:tr>
       <w:tr>
@@ -2051,8 +2169,21 @@
             <w:vAlign w:val="bottom"/>
           </w:tcPr>
           <w:p>
-            <w:r>
-              <w:t>{{ participante.ficha }}</w:t>
+            <w:proofErr w:type="gramStart"/>
+            <w:r>
+              <w:t xml:space="preserve">{{ </w:t>
+            </w:r>
+            <w:proofErr w:type="spellStart"/>
+            <w:r>
+              <w:t>participante</w:t>
+            </w:r>
+            <w:proofErr w:type="gramEnd"/>
+            <w:r>
+              <w:t>.ficha</w:t>
+            </w:r>
+            <w:proofErr w:type="spellEnd"/>
+            <w:r>
+              <w:t xml:space="preserve"> }}</w:t>
             </w:r>
           </w:p>
         </w:tc>
@@ -2063,8 +2194,21 @@
             <w:vAlign w:val="bottom"/>
           </w:tcPr>
           <w:p>
-            <w:r>
-              <w:t>{{ participante.nombre_completo }}</w:t>
+            <w:proofErr w:type="gramStart"/>
+            <w:r>
+              <w:t xml:space="preserve">{{ </w:t>
+            </w:r>
+            <w:proofErr w:type="spellStart"/>
+            <w:r>
+              <w:t>participante</w:t>
+            </w:r>
+            <w:proofErr w:type="gramEnd"/>
+            <w:r>
+              <w:t>.nombre_completo</w:t>
+            </w:r>
+            <w:proofErr w:type="spellEnd"/>
+            <w:r>
+              <w:t xml:space="preserve"> }}</w:t>
             </w:r>
           </w:p>
         </w:tc>
@@ -2074,9 +2218,7 @@
             <w:gridSpan w:val="2"/>
             <w:vAlign w:val="center"/>
           </w:tcPr>
-          <w:p>
-            <w:r/>
-          </w:p>
+          <w:p/>
         </w:tc>
         <w:tc>
           <w:tcPr>
@@ -2084,9 +2226,7 @@
             <w:gridSpan w:val="3"/>
             <w:vAlign w:val="bottom"/>
           </w:tcPr>
-          <w:p>
-            <w:r/>
-          </w:p>
+          <w:p/>
         </w:tc>
         <w:tc>
           <w:tcPr>
@@ -2094,9 +2234,7 @@
             <w:gridSpan w:val="3"/>
             <w:vAlign w:val="bottom"/>
           </w:tcPr>
-          <w:p>
-            <w:r/>
-          </w:p>
+          <w:p/>
         </w:tc>
         <w:tc>
           <w:tcPr>
@@ -2104,9 +2242,7 @@
             <w:gridSpan w:val="2"/>
             <w:vAlign w:val="center"/>
           </w:tcPr>
-          <w:p>
-            <w:r/>
-          </w:p>
+          <w:p/>
         </w:tc>
         <w:tc>
           <w:tcPr>
@@ -2114,9 +2250,7 @@
             <w:gridSpan w:val="2"/>
             <w:vAlign w:val="center"/>
           </w:tcPr>
-          <w:p>
-            <w:r/>
-          </w:p>
+          <w:p/>
         </w:tc>
         <w:tc>
           <w:tcPr>
@@ -2124,9 +2258,7 @@
             <w:gridSpan w:val="2"/>
             <w:vAlign w:val="center"/>
           </w:tcPr>
-          <w:p>
-            <w:r/>
-          </w:p>
+          <w:p/>
         </w:tc>
         <w:tc>
           <w:tcPr>
@@ -2134,9 +2266,7 @@
             <w:gridSpan w:val="3"/>
             <w:vAlign w:val="center"/>
           </w:tcPr>
-          <w:p>
-            <w:r/>
-          </w:p>
+          <w:p/>
         </w:tc>
         <w:tc>
           <w:tcPr>
@@ -2144,9 +2274,7 @@
             <w:gridSpan w:val="2"/>
             <w:vAlign w:val="center"/>
           </w:tcPr>
-          <w:p>
-            <w:r/>
-          </w:p>
+          <w:p/>
         </w:tc>
         <w:tc>
           <w:tcPr>
@@ -2154,9 +2282,7 @@
             <w:gridSpan w:val="2"/>
             <w:vAlign w:val="center"/>
           </w:tcPr>
-          <w:p>
-            <w:r/>
-          </w:p>
+          <w:p/>
         </w:tc>
         <w:tc>
           <w:tcPr>
@@ -2164,9 +2290,7 @@
             <w:gridSpan w:val="2"/>
             <w:vAlign w:val="center"/>
           </w:tcPr>
-          <w:p>
-            <w:r/>
-          </w:p>
+          <w:p/>
         </w:tc>
       </w:tr>
       <w:tr>
@@ -2181,7 +2305,23 @@
           </w:tcPr>
           <w:p>
             <w:r>
-              <w:t>{%tr endfor %}</w:t>
+              <w:t>{%</w:t>
+            </w:r>
+            <w:proofErr w:type="spellStart"/>
+            <w:r>
+              <w:t>tr</w:t>
+            </w:r>
+            <w:proofErr w:type="spellEnd"/>
+            <w:r>
+              <w:t xml:space="preserve"> </w:t>
+            </w:r>
+            <w:proofErr w:type="spellStart"/>
+            <w:r>
+              <w:t>endfor</w:t>
+            </w:r>
+            <w:proofErr w:type="spellEnd"/>
+            <w:r>
+              <w:t xml:space="preserve"> %}</w:t>
             </w:r>
           </w:p>
         </w:tc>
@@ -2191,9 +2331,7 @@
             <w:gridSpan w:val="4"/>
             <w:vAlign w:val="bottom"/>
           </w:tcPr>
-          <w:p>
-            <w:r/>
-          </w:p>
+          <w:p/>
         </w:tc>
         <w:tc>
           <w:tcPr>
@@ -2201,9 +2339,7 @@
             <w:gridSpan w:val="2"/>
             <w:vAlign w:val="center"/>
           </w:tcPr>
-          <w:p>
-            <w:r/>
-          </w:p>
+          <w:p/>
         </w:tc>
         <w:tc>
           <w:tcPr>
@@ -2211,9 +2347,7 @@
             <w:gridSpan w:val="3"/>
             <w:vAlign w:val="bottom"/>
           </w:tcPr>
-          <w:p>
-            <w:r/>
-          </w:p>
+          <w:p/>
         </w:tc>
         <w:tc>
           <w:tcPr>
@@ -2221,9 +2355,7 @@
             <w:gridSpan w:val="3"/>
             <w:vAlign w:val="bottom"/>
           </w:tcPr>
-          <w:p>
-            <w:r/>
-          </w:p>
+          <w:p/>
         </w:tc>
         <w:tc>
           <w:tcPr>
@@ -2231,9 +2363,7 @@
             <w:gridSpan w:val="2"/>
             <w:vAlign w:val="center"/>
           </w:tcPr>
-          <w:p>
-            <w:r/>
-          </w:p>
+          <w:p/>
         </w:tc>
         <w:tc>
           <w:tcPr>
@@ -2241,9 +2371,7 @@
             <w:gridSpan w:val="2"/>
             <w:vAlign w:val="center"/>
           </w:tcPr>
-          <w:p>
-            <w:r/>
-          </w:p>
+          <w:p/>
         </w:tc>
         <w:tc>
           <w:tcPr>
@@ -2251,9 +2379,7 @@
             <w:gridSpan w:val="2"/>
             <w:vAlign w:val="center"/>
           </w:tcPr>
-          <w:p>
-            <w:r/>
-          </w:p>
+          <w:p/>
         </w:tc>
         <w:tc>
           <w:tcPr>
@@ -2261,9 +2387,7 @@
             <w:gridSpan w:val="3"/>
             <w:vAlign w:val="center"/>
           </w:tcPr>
-          <w:p>
-            <w:r/>
-          </w:p>
+          <w:p/>
         </w:tc>
         <w:tc>
           <w:tcPr>
@@ -2271,9 +2395,7 @@
             <w:gridSpan w:val="2"/>
             <w:vAlign w:val="center"/>
           </w:tcPr>
-          <w:p>
-            <w:r/>
-          </w:p>
+          <w:p/>
         </w:tc>
         <w:tc>
           <w:tcPr>
@@ -2281,9 +2403,7 @@
             <w:gridSpan w:val="2"/>
             <w:vAlign w:val="center"/>
           </w:tcPr>
-          <w:p>
-            <w:r/>
-          </w:p>
+          <w:p/>
         </w:tc>
         <w:tc>
           <w:tcPr>
@@ -2291,957 +2411,12 @@
             <w:gridSpan w:val="2"/>
             <w:vAlign w:val="center"/>
           </w:tcPr>
-          <w:p>
-            <w:r/>
-          </w:p>
-        </w:tc>
-      </w:tr>
-      <w:tr>
-        <w:trPr>
-          <w:trHeight w:val="260"/>
-          <w:tblCellSpacing w:w="20" w:type="dxa"/>
-        </w:trPr>
-        <w:tc>
-          <w:tcPr>
-            <w:tcW w:w="1066" w:type="dxa"/>
-            <w:vAlign w:val="bottom"/>
-          </w:tcPr>
-          <w:p>
-            <w:pPr>
-              <w:rPr>
-                <w:rFonts w:ascii="Arial" w:hAnsi="Arial" w:cs="Arial"/>
-                <w:sz w:val="20"/>
-              </w:rPr>
-            </w:pPr>
-          </w:p>
-        </w:tc>
-        <w:tc>
-          <w:tcPr>
-            <w:tcW w:w="3461" w:type="dxa"/>
-            <w:gridSpan w:val="4"/>
-            <w:vAlign w:val="bottom"/>
-          </w:tcPr>
-          <w:p>
-            <w:pPr>
-              <w:rPr>
-                <w:rFonts w:ascii="Arial" w:hAnsi="Arial" w:cs="Arial"/>
-                <w:sz w:val="20"/>
-              </w:rPr>
-            </w:pPr>
-          </w:p>
-        </w:tc>
-        <w:tc>
-          <w:tcPr>
-            <w:tcW w:w="854" w:type="dxa"/>
-            <w:gridSpan w:val="2"/>
-          </w:tcPr>
-          <w:p>
-            <w:pPr>
-              <w:rPr>
-                <w:rFonts w:ascii="Arial" w:hAnsi="Arial" w:cs="Arial"/>
-                <w:sz w:val="20"/>
-              </w:rPr>
-            </w:pPr>
-          </w:p>
-        </w:tc>
-        <w:tc>
-          <w:tcPr>
-            <w:tcW w:w="2653" w:type="dxa"/>
-            <w:gridSpan w:val="3"/>
-            <w:vAlign w:val="bottom"/>
-          </w:tcPr>
-          <w:p>
-            <w:pPr>
-              <w:rPr>
-                <w:rFonts w:ascii="Arial" w:hAnsi="Arial" w:cs="Arial"/>
-                <w:sz w:val="16"/>
-                <w:szCs w:val="16"/>
-              </w:rPr>
-            </w:pPr>
-          </w:p>
-        </w:tc>
-        <w:tc>
-          <w:tcPr>
-            <w:tcW w:w="683" w:type="dxa"/>
-            <w:gridSpan w:val="3"/>
-            <w:vAlign w:val="bottom"/>
-          </w:tcPr>
-          <w:p>
-            <w:pPr>
-              <w:jc w:val="center"/>
-              <w:rPr>
-                <w:rFonts w:ascii="Arial" w:hAnsi="Arial" w:cs="Arial"/>
-                <w:sz w:val="20"/>
-              </w:rPr>
-            </w:pPr>
-          </w:p>
-        </w:tc>
-        <w:tc>
-          <w:tcPr>
-            <w:tcW w:w="796" w:type="dxa"/>
-            <w:gridSpan w:val="2"/>
-            <w:vAlign w:val="center"/>
-          </w:tcPr>
-          <w:p>
-            <w:pPr>
-              <w:jc w:val="center"/>
-              <w:rPr>
-                <w:rFonts w:ascii="Arial" w:hAnsi="Arial" w:cs="Arial"/>
-                <w:sz w:val="20"/>
-              </w:rPr>
-            </w:pPr>
-          </w:p>
-        </w:tc>
-        <w:tc>
-          <w:tcPr>
-            <w:tcW w:w="1094" w:type="dxa"/>
-            <w:gridSpan w:val="2"/>
-            <w:vAlign w:val="center"/>
-          </w:tcPr>
-          <w:p>
-            <w:pPr>
-              <w:rPr>
-                <w:rFonts w:ascii="Arial" w:hAnsi="Arial" w:cs="Arial"/>
-                <w:sz w:val="20"/>
-              </w:rPr>
-            </w:pPr>
-          </w:p>
-        </w:tc>
-        <w:tc>
-          <w:tcPr>
-            <w:tcW w:w="811" w:type="dxa"/>
-            <w:gridSpan w:val="2"/>
-            <w:vAlign w:val="center"/>
-          </w:tcPr>
-          <w:p>
-            <w:pPr>
-              <w:rPr>
-                <w:rFonts w:ascii="Arial" w:hAnsi="Arial" w:cs="Arial"/>
-                <w:sz w:val="20"/>
-              </w:rPr>
-            </w:pPr>
-          </w:p>
-        </w:tc>
-        <w:tc>
-          <w:tcPr>
-            <w:tcW w:w="668" w:type="dxa"/>
-            <w:gridSpan w:val="3"/>
-            <w:vAlign w:val="center"/>
-          </w:tcPr>
-          <w:p>
-            <w:pPr>
-              <w:rPr>
-                <w:rFonts w:ascii="Arial" w:hAnsi="Arial" w:cs="Arial"/>
-                <w:sz w:val="20"/>
-              </w:rPr>
-            </w:pPr>
-          </w:p>
-        </w:tc>
-        <w:tc>
-          <w:tcPr>
-            <w:tcW w:w="669" w:type="dxa"/>
-            <w:gridSpan w:val="2"/>
-            <w:vAlign w:val="center"/>
-          </w:tcPr>
-          <w:p>
-            <w:pPr>
-              <w:rPr>
-                <w:rFonts w:ascii="Arial" w:hAnsi="Arial" w:cs="Arial"/>
-                <w:sz w:val="20"/>
-              </w:rPr>
-            </w:pPr>
-          </w:p>
-        </w:tc>
-        <w:tc>
-          <w:tcPr>
-            <w:tcW w:w="669" w:type="dxa"/>
-            <w:gridSpan w:val="2"/>
-            <w:vAlign w:val="center"/>
-          </w:tcPr>
-          <w:p>
-            <w:pPr>
-              <w:pStyle w:val="Encabezado"/>
-              <w:tabs>
-                <w:tab w:val="clear" w:pos="4419"/>
-                <w:tab w:val="clear" w:pos="8838"/>
-              </w:tabs>
-              <w:rPr>
-                <w:rFonts w:ascii="Arial" w:hAnsi="Arial" w:cs="Arial"/>
-                <w:sz w:val="20"/>
-              </w:rPr>
-            </w:pPr>
-          </w:p>
-        </w:tc>
-        <w:tc>
-          <w:tcPr>
-            <w:tcW w:w="1216" w:type="dxa"/>
-            <w:gridSpan w:val="2"/>
-            <w:vAlign w:val="center"/>
-          </w:tcPr>
-          <w:p>
-            <w:pPr>
-              <w:rPr>
-                <w:rFonts w:ascii="Arial" w:hAnsi="Arial" w:cs="Arial"/>
-                <w:sz w:val="20"/>
-              </w:rPr>
-            </w:pPr>
-          </w:p>
-        </w:tc>
-      </w:tr>
-      <w:tr>
-        <w:trPr>
-          <w:trHeight w:val="260"/>
-          <w:tblCellSpacing w:w="20" w:type="dxa"/>
-        </w:trPr>
-        <w:tc>
-          <w:tcPr>
-            <w:tcW w:w="1066" w:type="dxa"/>
-            <w:vAlign w:val="bottom"/>
-          </w:tcPr>
-          <w:p>
-            <w:pPr>
-              <w:rPr>
-                <w:rFonts w:ascii="Arial" w:hAnsi="Arial" w:cs="Arial"/>
-                <w:sz w:val="20"/>
-              </w:rPr>
-            </w:pPr>
-          </w:p>
-        </w:tc>
-        <w:tc>
-          <w:tcPr>
-            <w:tcW w:w="3461" w:type="dxa"/>
-            <w:gridSpan w:val="4"/>
-            <w:vAlign w:val="bottom"/>
-          </w:tcPr>
-          <w:p>
-            <w:pPr>
-              <w:rPr>
-                <w:rFonts w:ascii="Arial" w:hAnsi="Arial" w:cs="Arial"/>
-                <w:sz w:val="20"/>
-              </w:rPr>
-            </w:pPr>
-          </w:p>
-        </w:tc>
-        <w:tc>
-          <w:tcPr>
-            <w:tcW w:w="854" w:type="dxa"/>
-            <w:gridSpan w:val="2"/>
-          </w:tcPr>
-          <w:p>
-            <w:pPr>
-              <w:rPr>
-                <w:rFonts w:ascii="Arial" w:hAnsi="Arial" w:cs="Arial"/>
-                <w:sz w:val="20"/>
-              </w:rPr>
-            </w:pPr>
-          </w:p>
-        </w:tc>
-        <w:tc>
-          <w:tcPr>
-            <w:tcW w:w="2653" w:type="dxa"/>
-            <w:gridSpan w:val="3"/>
-            <w:vAlign w:val="bottom"/>
-          </w:tcPr>
-          <w:p>
-            <w:pPr>
-              <w:rPr>
-                <w:rFonts w:ascii="Arial" w:hAnsi="Arial" w:cs="Arial"/>
-                <w:sz w:val="16"/>
-                <w:szCs w:val="16"/>
-              </w:rPr>
-            </w:pPr>
-          </w:p>
-        </w:tc>
-        <w:tc>
-          <w:tcPr>
-            <w:tcW w:w="683" w:type="dxa"/>
-            <w:gridSpan w:val="3"/>
-            <w:vAlign w:val="bottom"/>
-          </w:tcPr>
-          <w:p>
-            <w:pPr>
-              <w:jc w:val="center"/>
-              <w:rPr>
-                <w:rFonts w:ascii="Arial" w:hAnsi="Arial" w:cs="Arial"/>
-                <w:sz w:val="20"/>
-              </w:rPr>
-            </w:pPr>
-          </w:p>
-        </w:tc>
-        <w:tc>
-          <w:tcPr>
-            <w:tcW w:w="796" w:type="dxa"/>
-            <w:gridSpan w:val="2"/>
-            <w:vAlign w:val="center"/>
-          </w:tcPr>
-          <w:p>
-            <w:pPr>
-              <w:jc w:val="center"/>
-              <w:rPr>
-                <w:rFonts w:ascii="Arial" w:hAnsi="Arial" w:cs="Arial"/>
-                <w:sz w:val="20"/>
-              </w:rPr>
-            </w:pPr>
-          </w:p>
-        </w:tc>
-        <w:tc>
-          <w:tcPr>
-            <w:tcW w:w="1094" w:type="dxa"/>
-            <w:gridSpan w:val="2"/>
-            <w:vAlign w:val="center"/>
-          </w:tcPr>
-          <w:p>
-            <w:pPr>
-              <w:rPr>
-                <w:rFonts w:ascii="Arial" w:hAnsi="Arial" w:cs="Arial"/>
-                <w:sz w:val="20"/>
-              </w:rPr>
-            </w:pPr>
-          </w:p>
-        </w:tc>
-        <w:tc>
-          <w:tcPr>
-            <w:tcW w:w="811" w:type="dxa"/>
-            <w:gridSpan w:val="2"/>
-            <w:vAlign w:val="center"/>
-          </w:tcPr>
-          <w:p>
-            <w:pPr>
-              <w:rPr>
-                <w:rFonts w:ascii="Arial" w:hAnsi="Arial" w:cs="Arial"/>
-                <w:sz w:val="20"/>
-              </w:rPr>
-            </w:pPr>
-          </w:p>
-        </w:tc>
-        <w:tc>
-          <w:tcPr>
-            <w:tcW w:w="668" w:type="dxa"/>
-            <w:gridSpan w:val="3"/>
-            <w:vAlign w:val="center"/>
-          </w:tcPr>
-          <w:p>
-            <w:pPr>
-              <w:rPr>
-                <w:rFonts w:ascii="Arial" w:hAnsi="Arial" w:cs="Arial"/>
-                <w:sz w:val="20"/>
-              </w:rPr>
-            </w:pPr>
-          </w:p>
-        </w:tc>
-        <w:tc>
-          <w:tcPr>
-            <w:tcW w:w="669" w:type="dxa"/>
-            <w:gridSpan w:val="2"/>
-            <w:vAlign w:val="center"/>
-          </w:tcPr>
-          <w:p>
-            <w:pPr>
-              <w:rPr>
-                <w:rFonts w:ascii="Arial" w:hAnsi="Arial" w:cs="Arial"/>
-                <w:sz w:val="20"/>
-              </w:rPr>
-            </w:pPr>
-          </w:p>
-        </w:tc>
-        <w:tc>
-          <w:tcPr>
-            <w:tcW w:w="669" w:type="dxa"/>
-            <w:gridSpan w:val="2"/>
-            <w:vAlign w:val="center"/>
-          </w:tcPr>
-          <w:p>
-            <w:pPr>
-              <w:rPr>
-                <w:rFonts w:ascii="Arial" w:hAnsi="Arial" w:cs="Arial"/>
-                <w:sz w:val="20"/>
-              </w:rPr>
-            </w:pPr>
-          </w:p>
-        </w:tc>
-        <w:tc>
-          <w:tcPr>
-            <w:tcW w:w="1216" w:type="dxa"/>
-            <w:gridSpan w:val="2"/>
-            <w:vAlign w:val="center"/>
-          </w:tcPr>
-          <w:p>
-            <w:pPr>
-              <w:rPr>
-                <w:rFonts w:ascii="Arial" w:hAnsi="Arial" w:cs="Arial"/>
-                <w:sz w:val="20"/>
-              </w:rPr>
-            </w:pPr>
-          </w:p>
-        </w:tc>
-      </w:tr>
-      <w:tr>
-        <w:trPr>
-          <w:trHeight w:val="260"/>
-          <w:tblCellSpacing w:w="20" w:type="dxa"/>
-        </w:trPr>
-        <w:tc>
-          <w:tcPr>
-            <w:tcW w:w="1066" w:type="dxa"/>
-            <w:vAlign w:val="bottom"/>
-          </w:tcPr>
-          <w:p>
-            <w:pPr>
-              <w:rPr>
-                <w:rFonts w:ascii="Arial" w:hAnsi="Arial" w:cs="Arial"/>
-                <w:sz w:val="20"/>
-              </w:rPr>
-            </w:pPr>
-          </w:p>
-        </w:tc>
-        <w:tc>
-          <w:tcPr>
-            <w:tcW w:w="3461" w:type="dxa"/>
-            <w:gridSpan w:val="4"/>
-            <w:vAlign w:val="bottom"/>
-          </w:tcPr>
-          <w:p>
-            <w:pPr>
-              <w:rPr>
-                <w:rFonts w:ascii="Arial" w:hAnsi="Arial" w:cs="Arial"/>
-                <w:sz w:val="20"/>
-                <w:u w:val="single"/>
-              </w:rPr>
-            </w:pPr>
-          </w:p>
-        </w:tc>
-        <w:tc>
-          <w:tcPr>
-            <w:tcW w:w="854" w:type="dxa"/>
-            <w:gridSpan w:val="2"/>
-          </w:tcPr>
-          <w:p>
-            <w:pPr>
-              <w:rPr>
-                <w:rFonts w:ascii="Arial" w:hAnsi="Arial" w:cs="Arial"/>
-                <w:sz w:val="20"/>
-              </w:rPr>
-            </w:pPr>
-          </w:p>
-        </w:tc>
-        <w:tc>
-          <w:tcPr>
-            <w:tcW w:w="2653" w:type="dxa"/>
-            <w:gridSpan w:val="3"/>
-            <w:vAlign w:val="bottom"/>
-          </w:tcPr>
-          <w:p>
-            <w:pPr>
-              <w:rPr>
-                <w:rFonts w:ascii="Arial" w:hAnsi="Arial" w:cs="Arial"/>
-                <w:sz w:val="16"/>
-                <w:szCs w:val="16"/>
-              </w:rPr>
-            </w:pPr>
-          </w:p>
-        </w:tc>
-        <w:tc>
-          <w:tcPr>
-            <w:tcW w:w="683" w:type="dxa"/>
-            <w:gridSpan w:val="3"/>
-            <w:vAlign w:val="bottom"/>
-          </w:tcPr>
-          <w:p>
-            <w:pPr>
-              <w:jc w:val="center"/>
-              <w:rPr>
-                <w:rFonts w:ascii="Arial" w:hAnsi="Arial" w:cs="Arial"/>
-                <w:sz w:val="20"/>
-              </w:rPr>
-            </w:pPr>
-          </w:p>
-        </w:tc>
-        <w:tc>
-          <w:tcPr>
-            <w:tcW w:w="796" w:type="dxa"/>
-            <w:gridSpan w:val="2"/>
-            <w:vAlign w:val="center"/>
-          </w:tcPr>
-          <w:p>
-            <w:pPr>
-              <w:jc w:val="center"/>
-              <w:rPr>
-                <w:rFonts w:ascii="Arial" w:hAnsi="Arial" w:cs="Arial"/>
-                <w:sz w:val="20"/>
-              </w:rPr>
-            </w:pPr>
-          </w:p>
-        </w:tc>
-        <w:tc>
-          <w:tcPr>
-            <w:tcW w:w="1094" w:type="dxa"/>
-            <w:gridSpan w:val="2"/>
-            <w:vAlign w:val="center"/>
-          </w:tcPr>
-          <w:p>
-            <w:pPr>
-              <w:rPr>
-                <w:rFonts w:ascii="Arial" w:hAnsi="Arial" w:cs="Arial"/>
-                <w:sz w:val="20"/>
-              </w:rPr>
-            </w:pPr>
-          </w:p>
-        </w:tc>
-        <w:tc>
-          <w:tcPr>
-            <w:tcW w:w="811" w:type="dxa"/>
-            <w:gridSpan w:val="2"/>
-            <w:vAlign w:val="center"/>
-          </w:tcPr>
-          <w:p>
-            <w:pPr>
-              <w:rPr>
-                <w:rFonts w:ascii="Arial" w:hAnsi="Arial" w:cs="Arial"/>
-                <w:sz w:val="20"/>
-              </w:rPr>
-            </w:pPr>
-          </w:p>
-        </w:tc>
-        <w:tc>
-          <w:tcPr>
-            <w:tcW w:w="668" w:type="dxa"/>
-            <w:gridSpan w:val="3"/>
-            <w:vAlign w:val="center"/>
-          </w:tcPr>
-          <w:p>
-            <w:pPr>
-              <w:rPr>
-                <w:rFonts w:ascii="Arial" w:hAnsi="Arial" w:cs="Arial"/>
-                <w:sz w:val="20"/>
-              </w:rPr>
-            </w:pPr>
-          </w:p>
-        </w:tc>
-        <w:tc>
-          <w:tcPr>
-            <w:tcW w:w="669" w:type="dxa"/>
-            <w:gridSpan w:val="2"/>
-            <w:vAlign w:val="center"/>
-          </w:tcPr>
-          <w:p>
-            <w:pPr>
-              <w:rPr>
-                <w:rFonts w:ascii="Arial" w:hAnsi="Arial" w:cs="Arial"/>
-                <w:sz w:val="20"/>
-              </w:rPr>
-            </w:pPr>
-          </w:p>
-        </w:tc>
-        <w:tc>
-          <w:tcPr>
-            <w:tcW w:w="669" w:type="dxa"/>
-            <w:gridSpan w:val="2"/>
-            <w:vAlign w:val="center"/>
-          </w:tcPr>
-          <w:p>
-            <w:pPr>
-              <w:rPr>
-                <w:rFonts w:ascii="Arial" w:hAnsi="Arial" w:cs="Arial"/>
-                <w:sz w:val="20"/>
-              </w:rPr>
-            </w:pPr>
-          </w:p>
-        </w:tc>
-        <w:tc>
-          <w:tcPr>
-            <w:tcW w:w="1216" w:type="dxa"/>
-            <w:gridSpan w:val="2"/>
-            <w:vAlign w:val="center"/>
-          </w:tcPr>
-          <w:p>
-            <w:pPr>
-              <w:rPr>
-                <w:rFonts w:ascii="Arial" w:hAnsi="Arial" w:cs="Arial"/>
-                <w:sz w:val="20"/>
-              </w:rPr>
-            </w:pPr>
-          </w:p>
-        </w:tc>
-      </w:tr>
-      <w:tr>
-        <w:trPr>
-          <w:trHeight w:val="260"/>
-          <w:tblCellSpacing w:w="20" w:type="dxa"/>
-        </w:trPr>
-        <w:tc>
-          <w:tcPr>
-            <w:tcW w:w="1066" w:type="dxa"/>
-            <w:vAlign w:val="bottom"/>
-          </w:tcPr>
-          <w:p>
-            <w:pPr>
-              <w:rPr>
-                <w:rFonts w:ascii="Arial" w:hAnsi="Arial" w:cs="Arial"/>
-                <w:sz w:val="20"/>
-              </w:rPr>
-            </w:pPr>
-          </w:p>
-        </w:tc>
-        <w:tc>
-          <w:tcPr>
-            <w:tcW w:w="3461" w:type="dxa"/>
-            <w:gridSpan w:val="4"/>
-            <w:vAlign w:val="bottom"/>
-          </w:tcPr>
-          <w:p>
-            <w:pPr>
-              <w:rPr>
-                <w:rFonts w:ascii="Arial" w:hAnsi="Arial" w:cs="Arial"/>
-                <w:sz w:val="20"/>
-              </w:rPr>
-            </w:pPr>
-          </w:p>
-        </w:tc>
-        <w:tc>
-          <w:tcPr>
-            <w:tcW w:w="854" w:type="dxa"/>
-            <w:gridSpan w:val="2"/>
-          </w:tcPr>
-          <w:p>
-            <w:pPr>
-              <w:rPr>
-                <w:rFonts w:ascii="Arial" w:hAnsi="Arial" w:cs="Arial"/>
-                <w:sz w:val="20"/>
-              </w:rPr>
-            </w:pPr>
-          </w:p>
-        </w:tc>
-        <w:tc>
-          <w:tcPr>
-            <w:tcW w:w="2653" w:type="dxa"/>
-            <w:gridSpan w:val="3"/>
-            <w:vAlign w:val="bottom"/>
-          </w:tcPr>
-          <w:p>
-            <w:pPr>
-              <w:rPr>
-                <w:rFonts w:ascii="Arial" w:hAnsi="Arial" w:cs="Arial"/>
-                <w:sz w:val="16"/>
-                <w:szCs w:val="16"/>
-              </w:rPr>
-            </w:pPr>
-          </w:p>
-        </w:tc>
-        <w:tc>
-          <w:tcPr>
-            <w:tcW w:w="683" w:type="dxa"/>
-            <w:gridSpan w:val="3"/>
-            <w:vAlign w:val="bottom"/>
-          </w:tcPr>
-          <w:p>
-            <w:pPr>
-              <w:jc w:val="center"/>
-              <w:rPr>
-                <w:rFonts w:ascii="Arial" w:hAnsi="Arial" w:cs="Arial"/>
-                <w:sz w:val="20"/>
-              </w:rPr>
-            </w:pPr>
-          </w:p>
-        </w:tc>
-        <w:tc>
-          <w:tcPr>
-            <w:tcW w:w="796" w:type="dxa"/>
-            <w:gridSpan w:val="2"/>
-            <w:vAlign w:val="center"/>
-          </w:tcPr>
-          <w:p>
-            <w:pPr>
-              <w:jc w:val="center"/>
-              <w:rPr>
-                <w:rFonts w:ascii="Arial" w:hAnsi="Arial" w:cs="Arial"/>
-                <w:sz w:val="20"/>
-              </w:rPr>
-            </w:pPr>
-          </w:p>
-        </w:tc>
-        <w:tc>
-          <w:tcPr>
-            <w:tcW w:w="1094" w:type="dxa"/>
-            <w:gridSpan w:val="2"/>
-            <w:vAlign w:val="center"/>
-          </w:tcPr>
-          <w:p>
-            <w:pPr>
-              <w:rPr>
-                <w:rFonts w:ascii="Arial" w:hAnsi="Arial" w:cs="Arial"/>
-                <w:sz w:val="20"/>
-              </w:rPr>
-            </w:pPr>
-          </w:p>
-        </w:tc>
-        <w:tc>
-          <w:tcPr>
-            <w:tcW w:w="811" w:type="dxa"/>
-            <w:gridSpan w:val="2"/>
-            <w:vAlign w:val="center"/>
-          </w:tcPr>
-          <w:p>
-            <w:pPr>
-              <w:rPr>
-                <w:rFonts w:ascii="Arial" w:hAnsi="Arial" w:cs="Arial"/>
-                <w:sz w:val="20"/>
-              </w:rPr>
-            </w:pPr>
-          </w:p>
-        </w:tc>
-        <w:tc>
-          <w:tcPr>
-            <w:tcW w:w="668" w:type="dxa"/>
-            <w:gridSpan w:val="3"/>
-            <w:vAlign w:val="center"/>
-          </w:tcPr>
-          <w:p>
-            <w:pPr>
-              <w:rPr>
-                <w:rFonts w:ascii="Arial" w:hAnsi="Arial" w:cs="Arial"/>
-                <w:sz w:val="20"/>
-              </w:rPr>
-            </w:pPr>
-          </w:p>
-        </w:tc>
-        <w:tc>
-          <w:tcPr>
-            <w:tcW w:w="669" w:type="dxa"/>
-            <w:gridSpan w:val="2"/>
-            <w:vAlign w:val="center"/>
-          </w:tcPr>
-          <w:p>
-            <w:pPr>
-              <w:rPr>
-                <w:rFonts w:ascii="Arial" w:hAnsi="Arial" w:cs="Arial"/>
-                <w:sz w:val="20"/>
-              </w:rPr>
-            </w:pPr>
-          </w:p>
-        </w:tc>
-        <w:tc>
-          <w:tcPr>
-            <w:tcW w:w="669" w:type="dxa"/>
-            <w:gridSpan w:val="2"/>
-            <w:vAlign w:val="center"/>
-          </w:tcPr>
-          <w:p>
-            <w:pPr>
-              <w:rPr>
-                <w:rFonts w:ascii="Arial" w:hAnsi="Arial" w:cs="Arial"/>
-                <w:sz w:val="20"/>
-              </w:rPr>
-            </w:pPr>
-          </w:p>
-        </w:tc>
-        <w:tc>
-          <w:tcPr>
-            <w:tcW w:w="1216" w:type="dxa"/>
-            <w:gridSpan w:val="2"/>
-            <w:vAlign w:val="center"/>
-          </w:tcPr>
-          <w:p>
-            <w:pPr>
-              <w:rPr>
-                <w:rFonts w:ascii="Arial" w:hAnsi="Arial" w:cs="Arial"/>
-                <w:sz w:val="20"/>
-              </w:rPr>
-            </w:pPr>
-          </w:p>
-        </w:tc>
-      </w:tr>
-      <w:tr>
-        <w:trPr>
-          <w:trHeight w:val="260"/>
-          <w:tblCellSpacing w:w="20" w:type="dxa"/>
-        </w:trPr>
-        <w:tc>
-          <w:tcPr>
-            <w:tcW w:w="1066" w:type="dxa"/>
-            <w:vAlign w:val="bottom"/>
-          </w:tcPr>
-          <w:p>
-            <w:pPr>
-              <w:ind w:left="-35"/>
-              <w:rPr>
-                <w:rFonts w:ascii="Arial" w:hAnsi="Arial" w:cs="Arial"/>
-                <w:sz w:val="20"/>
-              </w:rPr>
-            </w:pPr>
-          </w:p>
-        </w:tc>
-        <w:tc>
-          <w:tcPr>
-            <w:tcW w:w="3461" w:type="dxa"/>
-            <w:gridSpan w:val="4"/>
-            <w:vAlign w:val="bottom"/>
-          </w:tcPr>
-          <w:p>
-            <w:pPr>
-              <w:rPr>
-                <w:rFonts w:ascii="Arial" w:hAnsi="Arial" w:cs="Arial"/>
-                <w:sz w:val="20"/>
-              </w:rPr>
-            </w:pPr>
-          </w:p>
-        </w:tc>
-        <w:tc>
-          <w:tcPr>
-            <w:tcW w:w="854" w:type="dxa"/>
-            <w:gridSpan w:val="2"/>
-          </w:tcPr>
-          <w:p>
-            <w:pPr>
-              <w:rPr>
-                <w:rFonts w:ascii="Arial" w:hAnsi="Arial" w:cs="Arial"/>
-                <w:sz w:val="20"/>
-              </w:rPr>
-            </w:pPr>
-          </w:p>
-        </w:tc>
-        <w:tc>
-          <w:tcPr>
-            <w:tcW w:w="2653" w:type="dxa"/>
-            <w:gridSpan w:val="3"/>
-            <w:vAlign w:val="bottom"/>
-          </w:tcPr>
-          <w:p>
-            <w:pPr>
-              <w:rPr>
-                <w:rFonts w:ascii="Arial" w:hAnsi="Arial" w:cs="Arial"/>
-                <w:sz w:val="16"/>
-                <w:szCs w:val="16"/>
-              </w:rPr>
-            </w:pPr>
-          </w:p>
-        </w:tc>
-        <w:tc>
-          <w:tcPr>
-            <w:tcW w:w="683" w:type="dxa"/>
-            <w:gridSpan w:val="3"/>
-            <w:vAlign w:val="bottom"/>
-          </w:tcPr>
-          <w:p>
-            <w:pPr>
-              <w:jc w:val="center"/>
-              <w:rPr>
-                <w:rFonts w:ascii="Arial" w:hAnsi="Arial" w:cs="Arial"/>
-                <w:sz w:val="20"/>
-              </w:rPr>
-            </w:pPr>
-          </w:p>
-        </w:tc>
-        <w:tc>
-          <w:tcPr>
-            <w:tcW w:w="796" w:type="dxa"/>
-            <w:gridSpan w:val="2"/>
-            <w:vAlign w:val="center"/>
-          </w:tcPr>
-          <w:p>
-            <w:pPr>
-              <w:jc w:val="center"/>
-              <w:rPr>
-                <w:rFonts w:ascii="Arial" w:hAnsi="Arial" w:cs="Arial"/>
-                <w:sz w:val="20"/>
-              </w:rPr>
-            </w:pPr>
-          </w:p>
-        </w:tc>
-        <w:tc>
-          <w:tcPr>
-            <w:tcW w:w="1094" w:type="dxa"/>
-            <w:gridSpan w:val="2"/>
-            <w:vAlign w:val="center"/>
-          </w:tcPr>
-          <w:p>
-            <w:pPr>
-              <w:rPr>
-                <w:rFonts w:ascii="Arial" w:hAnsi="Arial" w:cs="Arial"/>
-                <w:sz w:val="20"/>
-              </w:rPr>
-            </w:pPr>
-          </w:p>
-        </w:tc>
-        <w:tc>
-          <w:tcPr>
-            <w:tcW w:w="811" w:type="dxa"/>
-            <w:gridSpan w:val="2"/>
-            <w:vAlign w:val="center"/>
-          </w:tcPr>
-          <w:p>
-            <w:pPr>
-              <w:rPr>
-                <w:rFonts w:ascii="Arial" w:hAnsi="Arial" w:cs="Arial"/>
-                <w:sz w:val="20"/>
-              </w:rPr>
-            </w:pPr>
-          </w:p>
-        </w:tc>
-        <w:tc>
-          <w:tcPr>
-            <w:tcW w:w="668" w:type="dxa"/>
-            <w:gridSpan w:val="3"/>
-            <w:vAlign w:val="center"/>
-          </w:tcPr>
-          <w:p>
-            <w:pPr>
-              <w:rPr>
-                <w:rFonts w:ascii="Arial" w:hAnsi="Arial" w:cs="Arial"/>
-                <w:sz w:val="20"/>
-              </w:rPr>
-            </w:pPr>
-          </w:p>
-        </w:tc>
-        <w:tc>
-          <w:tcPr>
-            <w:tcW w:w="669" w:type="dxa"/>
-            <w:gridSpan w:val="2"/>
-            <w:vAlign w:val="center"/>
-          </w:tcPr>
-          <w:p>
-            <w:pPr>
-              <w:rPr>
-                <w:rFonts w:ascii="Arial" w:hAnsi="Arial" w:cs="Arial"/>
-                <w:sz w:val="20"/>
-              </w:rPr>
-            </w:pPr>
-          </w:p>
-        </w:tc>
-        <w:tc>
-          <w:tcPr>
-            <w:tcW w:w="669" w:type="dxa"/>
-            <w:gridSpan w:val="2"/>
-            <w:vAlign w:val="center"/>
-          </w:tcPr>
-          <w:p>
-            <w:pPr>
-              <w:rPr>
-                <w:rFonts w:ascii="Arial" w:hAnsi="Arial" w:cs="Arial"/>
-                <w:sz w:val="20"/>
-              </w:rPr>
-            </w:pPr>
-          </w:p>
-        </w:tc>
-        <w:tc>
-          <w:tcPr>
-            <w:tcW w:w="1216" w:type="dxa"/>
-            <w:gridSpan w:val="2"/>
-            <w:vAlign w:val="center"/>
-          </w:tcPr>
-          <w:p>
-            <w:pPr>
-              <w:rPr>
-                <w:rFonts w:ascii="Arial" w:hAnsi="Arial" w:cs="Arial"/>
-                <w:sz w:val="20"/>
-              </w:rPr>
-            </w:pPr>
-          </w:p>
+          <w:p/>
         </w:tc>
       </w:tr>
     </w:tbl>
     <w:p>
       <w:pPr>
-        <w:spacing w:line="120" w:lineRule="exact"/>
         <w:rPr>
           <w:color w:val="FFFFFF"/>
           <w:sz w:val="8"/>
@@ -3251,15 +2426,6 @@
     </w:p>
     <w:p>
       <w:pPr>
-        <w:rPr>
-          <w:color w:val="FFFFFF"/>
-          <w:sz w:val="16"/>
-        </w:rPr>
-      </w:pPr>
-    </w:p>
-    <w:p>
-      <w:pPr>
-        <w:ind w:left="708" w:hanging="708"/>
         <w:rPr>
           <w:color w:val="FF0000"/>
         </w:rPr>
@@ -3311,7 +2477,6 @@
                 <w:b/>
                 <w:szCs w:val="16"/>
               </w:rPr>
-              <w:lastRenderedPageBreak/>
               <w:t>Instructor (es)</w:t>
             </w:r>
           </w:p>
@@ -3396,31 +2561,103 @@
                 <w:sz w:val="22"/>
                 <w:szCs w:val="22"/>
               </w:rPr>
-              <w:t>{{nombre_instructor }}</w:t>
-            </w:r>
+              <w:t>{{</w:t>
+            </w:r>
+            <w:proofErr w:type="spellStart"/>
             <w:r>
               <w:rPr>
                 <w:rFonts w:ascii="Arial" w:hAnsi="Arial" w:cs="Arial"/>
                 <w:sz w:val="22"/>
                 <w:szCs w:val="22"/>
               </w:rPr>
-              <w:t xml:space="preserve"> </w:t>
-            </w:r>
+              <w:t>nombre_</w:t>
+            </w:r>
+            <w:proofErr w:type="gramStart"/>
             <w:r>
               <w:rPr>
                 <w:rFonts w:ascii="Arial" w:hAnsi="Arial" w:cs="Arial"/>
                 <w:sz w:val="22"/>
                 <w:szCs w:val="22"/>
               </w:rPr>
-              <w:t>F-</w:t>
-            </w:r>
+              <w:t>instructor</w:t>
+            </w:r>
+            <w:proofErr w:type="spellEnd"/>
             <w:r>
               <w:rPr>
                 <w:rFonts w:ascii="Arial" w:hAnsi="Arial" w:cs="Arial"/>
                 <w:sz w:val="22"/>
                 <w:szCs w:val="22"/>
               </w:rPr>
-              <w:t xml:space="preserve"> {{ ficha_instructor }}</w:t>
+              <w:t xml:space="preserve"> }</w:t>
+            </w:r>
+            <w:proofErr w:type="gramEnd"/>
+            <w:r>
+              <w:rPr>
+                <w:rFonts w:ascii="Arial" w:hAnsi="Arial" w:cs="Arial"/>
+                <w:sz w:val="22"/>
+                <w:szCs w:val="22"/>
+              </w:rPr>
+              <w:t>}</w:t>
+            </w:r>
+            <w:r>
+              <w:rPr>
+                <w:rFonts w:ascii="Arial" w:hAnsi="Arial" w:cs="Arial"/>
+                <w:sz w:val="22"/>
+                <w:szCs w:val="22"/>
+              </w:rPr>
+              <w:t xml:space="preserve"> </w:t>
+            </w:r>
+            <w:r>
+              <w:rPr>
+                <w:rFonts w:ascii="Arial" w:hAnsi="Arial" w:cs="Arial"/>
+                <w:sz w:val="22"/>
+                <w:szCs w:val="22"/>
+              </w:rPr>
+              <w:t>F-</w:t>
+            </w:r>
+            <w:r>
+              <w:rPr>
+                <w:rFonts w:ascii="Arial" w:hAnsi="Arial" w:cs="Arial"/>
+                <w:sz w:val="22"/>
+                <w:szCs w:val="22"/>
+              </w:rPr>
+              <w:t xml:space="preserve"> </w:t>
+            </w:r>
+            <w:proofErr w:type="gramStart"/>
+            <w:r>
+              <w:rPr>
+                <w:rFonts w:ascii="Arial" w:hAnsi="Arial" w:cs="Arial"/>
+                <w:sz w:val="22"/>
+                <w:szCs w:val="22"/>
+              </w:rPr>
+              <w:t xml:space="preserve">{{ </w:t>
+            </w:r>
+            <w:proofErr w:type="spellStart"/>
+            <w:r>
+              <w:rPr>
+                <w:rFonts w:ascii="Arial" w:hAnsi="Arial" w:cs="Arial"/>
+                <w:sz w:val="22"/>
+                <w:szCs w:val="22"/>
+              </w:rPr>
+              <w:t>ficha</w:t>
+            </w:r>
+            <w:proofErr w:type="gramEnd"/>
+            <w:r>
+              <w:rPr>
+                <w:rFonts w:ascii="Arial" w:hAnsi="Arial" w:cs="Arial"/>
+                <w:sz w:val="22"/>
+                <w:szCs w:val="22"/>
+              </w:rPr>
+              <w:t>_instructor</w:t>
+            </w:r>
+            <w:proofErr w:type="spellEnd"/>
+            <w:r>
+              <w:rPr>
+                <w:rFonts w:ascii="Arial" w:hAnsi="Arial" w:cs="Arial"/>
+                <w:sz w:val="22"/>
+                <w:szCs w:val="22"/>
+              </w:rPr>
+              <w:t xml:space="preserve"> }}</w:t>
             </w:r>
           </w:p>
         </w:tc>
@@ -4004,10 +3241,10 @@
                 <v:path o:extrusionok="f" gradientshapeok="t" o:connecttype="rect"/>
                 <o:lock v:ext="edit" aspectratio="t"/>
               </v:shapetype>
-              <v:shape id="_x0000_i1025" type="#_x0000_t75" alt="" style="width:129.6pt;height:45.1pt;mso-width-percent:0;mso-height-percent:0;mso-width-percent:0;mso-height-percent:0">
+              <v:shape id="_x0000_i1025" type="#_x0000_t75" alt="" style="width:129.8pt;height:45pt;mso-width-percent:0;mso-height-percent:0;mso-width-percent:0;mso-height-percent:0">
                 <v:imagedata r:id="rId1" o:title=""/>
               </v:shape>
-              <o:OLEObject Type="Embed" ProgID="PBrush" ShapeID="_x0000_i1025" DrawAspect="Content" ObjectID="_1850309631" r:id="rId2"/>
+              <o:OLEObject Type="Embed" ProgID="PBrush" ShapeID="_x0000_i1025" DrawAspect="Content" ObjectID="_1850541729" r:id="rId2"/>
             </w:object>
           </w:r>
         </w:p>
@@ -4922,28 +4159,10 @@
 </file>
 
 <file path=customXml/item1.xml><?xml version="1.0" encoding="utf-8"?>
-<?mso-contentType ?>
-<FormTemplates xmlns="http://schemas.microsoft.com/sharepoint/v3/contenttype/forms">
-  <Display>DocumentLibraryForm</Display>
-  <Edit>DocumentLibraryForm</Edit>
-  <New>DocumentLibraryForm</New>
-</FormTemplates>
+<b:Sources xmlns:b="http://schemas.openxmlformats.org/officeDocument/2006/bibliography" xmlns="http://schemas.openxmlformats.org/officeDocument/2006/bibliography" SelectedStyle="\APASixthEditionOfficeOnline.xsl" StyleName="APA" Version="6"/>
 </file>
 
 <file path=customXml/item2.xml><?xml version="1.0" encoding="utf-8"?>
-<p:properties xmlns:p="http://schemas.microsoft.com/office/2006/metadata/properties" xmlns:xsi="http://www.w3.org/2001/XMLSchema-instance" xmlns:pc="http://schemas.microsoft.com/office/infopath/2007/PartnerControls">
-  <documentManagement>
-    <lcf76f155ced4ddcb4097134ff3c332f xmlns="aa5afa56-7e35-446d-92fd-ff9896fa623a">
-      <Terms xmlns="http://schemas.microsoft.com/office/infopath/2007/PartnerControls"/>
-    </lcf76f155ced4ddcb4097134ff3c332f>
-    <TaxCatchAll xmlns="6fd75834-9ba6-41f9-b1c8-ae1f15b4a690" xsi:nil="true"/>
-    <_ip_UnifiedCompliancePolicyUIAction xmlns="http://schemas.microsoft.com/sharepoint/v3" xsi:nil="true"/>
-    <_ip_UnifiedCompliancePolicyProperties xmlns="http://schemas.microsoft.com/sharepoint/v3" xsi:nil="true"/>
-  </documentManagement>
-</p:properties>
-</file>
-
-<file path=customXml/item3.xml><?xml version="1.0" encoding="utf-8"?>
 <ct:contentTypeSchema xmlns:ct="http://schemas.microsoft.com/office/2006/metadata/contentType" xmlns:ma="http://schemas.microsoft.com/office/2006/metadata/properties/metaAttributes" ct:_="" ma:_="" ma:contentTypeName="Documento" ma:contentTypeID="0x010100A87C2EA155D72146AF5E83CE3CFFEB38" ma:contentTypeVersion="15" ma:contentTypeDescription="Crear nuevo documento." ma:contentTypeScope="" ma:versionID="18a8814fc859c49a9914bd993aa96308">
   <xsd:schema xmlns:xsd="http://www.w3.org/2001/XMLSchema" xmlns:xs="http://www.w3.org/2001/XMLSchema" xmlns:p="http://schemas.microsoft.com/office/2006/metadata/properties" xmlns:ns1="http://schemas.microsoft.com/sharepoint/v3" xmlns:ns2="aa5afa56-7e35-446d-92fd-ff9896fa623a" xmlns:ns3="6fd75834-9ba6-41f9-b1c8-ae1f15b4a690" targetNamespace="http://schemas.microsoft.com/office/2006/metadata/properties" ma:root="true" ma:fieldsID="b5ab34ea1fc8b639d8e6f399185c44ce" ns1:_="" ns2:_="" ns3:_="">
     <xsd:import namespace="http://schemas.microsoft.com/sharepoint/v3"/>
@@ -5167,31 +4386,37 @@
 </ct:contentTypeSchema>
 </file>
 
+<file path=customXml/item3.xml><?xml version="1.0" encoding="utf-8"?>
+<p:properties xmlns:p="http://schemas.microsoft.com/office/2006/metadata/properties" xmlns:xsi="http://www.w3.org/2001/XMLSchema-instance" xmlns:pc="http://schemas.microsoft.com/office/infopath/2007/PartnerControls">
+  <documentManagement>
+    <lcf76f155ced4ddcb4097134ff3c332f xmlns="aa5afa56-7e35-446d-92fd-ff9896fa623a">
+      <Terms xmlns="http://schemas.microsoft.com/office/infopath/2007/PartnerControls"/>
+    </lcf76f155ced4ddcb4097134ff3c332f>
+    <TaxCatchAll xmlns="6fd75834-9ba6-41f9-b1c8-ae1f15b4a690" xsi:nil="true"/>
+    <_ip_UnifiedCompliancePolicyUIAction xmlns="http://schemas.microsoft.com/sharepoint/v3" xsi:nil="true"/>
+    <_ip_UnifiedCompliancePolicyProperties xmlns="http://schemas.microsoft.com/sharepoint/v3" xsi:nil="true"/>
+  </documentManagement>
+</p:properties>
+</file>
+
 <file path=customXml/item4.xml><?xml version="1.0" encoding="utf-8"?>
-<b:Sources xmlns:b="http://schemas.openxmlformats.org/officeDocument/2006/bibliography" xmlns="http://schemas.openxmlformats.org/officeDocument/2006/bibliography" SelectedStyle="\APASixthEditionOfficeOnline.xsl" StyleName="APA" Version="6"/>
+<?mso-contentType ?>
+<FormTemplates xmlns="http://schemas.microsoft.com/sharepoint/v3/contenttype/forms">
+  <Display>DocumentLibraryForm</Display>
+  <Edit>DocumentLibraryForm</Edit>
+  <New>DocumentLibraryForm</New>
+</FormTemplates>
 </file>
 
 <file path=customXml/itemProps1.xml><?xml version="1.0" encoding="utf-8"?>
-<ds:datastoreItem xmlns:ds="http://schemas.openxmlformats.org/officeDocument/2006/customXml" ds:itemID="{1A5A6B0B-D3EB-40CD-B919-06BA2CB67AEA}">
+<ds:datastoreItem xmlns:ds="http://schemas.openxmlformats.org/officeDocument/2006/customXml" ds:itemID="{F11C60CF-23AA-469C-9C7A-597742E474D2}">
   <ds:schemaRefs>
-    <ds:schemaRef ds:uri="http://schemas.microsoft.com/sharepoint/v3/contenttype/forms"/>
+    <ds:schemaRef ds:uri="http://schemas.openxmlformats.org/officeDocument/2006/bibliography"/>
   </ds:schemaRefs>
 </ds:datastoreItem>
 </file>
 
 <file path=customXml/itemProps2.xml><?xml version="1.0" encoding="utf-8"?>
-<ds:datastoreItem xmlns:ds="http://schemas.openxmlformats.org/officeDocument/2006/customXml" ds:itemID="{80A66124-CC99-4266-A874-6B19C62BC465}">
-  <ds:schemaRefs>
-    <ds:schemaRef ds:uri="http://schemas.microsoft.com/office/2006/metadata/properties"/>
-    <ds:schemaRef ds:uri="http://schemas.microsoft.com/office/infopath/2007/PartnerControls"/>
-    <ds:schemaRef ds:uri="aa5afa56-7e35-446d-92fd-ff9896fa623a"/>
-    <ds:schemaRef ds:uri="6fd75834-9ba6-41f9-b1c8-ae1f15b4a690"/>
-    <ds:schemaRef ds:uri="http://schemas.microsoft.com/sharepoint/v3"/>
-  </ds:schemaRefs>
-</ds:datastoreItem>
-</file>
-
-<file path=customXml/itemProps3.xml><?xml version="1.0" encoding="utf-8"?>
 <ds:datastoreItem xmlns:ds="http://schemas.openxmlformats.org/officeDocument/2006/customXml" ds:itemID="{C7A367BE-7B43-44E8-A6EE-18C956303CD0}">
   <ds:schemaRefs>
     <ds:schemaRef ds:uri="http://schemas.microsoft.com/office/2006/metadata/contentType"/>
@@ -5211,10 +4436,22 @@
 </ds:datastoreItem>
 </file>
 
+<file path=customXml/itemProps3.xml><?xml version="1.0" encoding="utf-8"?>
+<ds:datastoreItem xmlns:ds="http://schemas.openxmlformats.org/officeDocument/2006/customXml" ds:itemID="{80A66124-CC99-4266-A874-6B19C62BC465}">
+  <ds:schemaRefs>
+    <ds:schemaRef ds:uri="http://schemas.microsoft.com/office/2006/metadata/properties"/>
+    <ds:schemaRef ds:uri="http://schemas.microsoft.com/office/infopath/2007/PartnerControls"/>
+    <ds:schemaRef ds:uri="aa5afa56-7e35-446d-92fd-ff9896fa623a"/>
+    <ds:schemaRef ds:uri="6fd75834-9ba6-41f9-b1c8-ae1f15b4a690"/>
+    <ds:schemaRef ds:uri="http://schemas.microsoft.com/sharepoint/v3"/>
+  </ds:schemaRefs>
+</ds:datastoreItem>
+</file>
+
 <file path=customXml/itemProps4.xml><?xml version="1.0" encoding="utf-8"?>
-<ds:datastoreItem xmlns:ds="http://schemas.openxmlformats.org/officeDocument/2006/customXml" ds:itemID="{F11C60CF-23AA-469C-9C7A-597742E474D2}">
+<ds:datastoreItem xmlns:ds="http://schemas.openxmlformats.org/officeDocument/2006/customXml" ds:itemID="{1A5A6B0B-D3EB-40CD-B919-06BA2CB67AEA}">
   <ds:schemaRefs>
-    <ds:schemaRef ds:uri="http://schemas.openxmlformats.org/officeDocument/2006/bibliography"/>
+    <ds:schemaRef ds:uri="http://schemas.microsoft.com/sharepoint/v3/contenttype/forms"/>
   </ds:schemaRefs>
 </ds:datastoreItem>
 </file>
</xml_diff>